<commit_message>
vault backup: 2026-10-25 14:42:02
</commit_message>
<xml_diff>
--- a/docs/pdr-2027-xxx.docx
+++ b/docs/pdr-2027-xxx.docx
@@ -1375,7 +1375,59 @@
           <w:szCs w:val="22"/>
           <w:rtl w:val="1"/>
         </w:rPr>
-        <w:t xml:space="preserve"> לניטור רציף של כוורות דבורים. בכל כוורת מותקן צומת חיישנים מבוסס מיקרו-בקר הפועל על סוללה: חיישן תאוצה (רטט) המוצמד למסגרת הוולדות, ארבעה תאי עומס מתחת לכוורת, וחיישני טמפרטורה ולחות. הצומת מחשב בעצמו את ספקטרום תדרי הזמזום בתחום </w:t>
+        <w:t xml:space="preserve"> לניטור רציף של כוורות דבורים בכוורן ללא חשמל וללא רשת. בכל כוורת מותקן צומת סוללתי מבוסס </w:t>
+      </w:r>
+      <w:r>
+        <w:rPr>
+          <w:rFonts w:ascii="Times New Roman" w:cs="Times New Roman" w:eastAsia="Times New Roman" w:hAnsi="Times New Roman"/>
+          <w:b w:val="0"/>
+          <w:bCs w:val="0"/>
+          <w:i w:val="0"/>
+          <w:iCs w:val="0"/>
+          <w:sz w:val="22"/>
+          <w:szCs w:val="22"/>
+          <w:rtl w:val="0"/>
+        </w:rPr>
+        <w:t xml:space="preserve">ESP32-C3</w:t>
+      </w:r>
+      <w:r>
+        <w:rPr>
+          <w:rFonts w:ascii="Times New Roman" w:cs="Times New Roman" w:eastAsia="Times New Roman" w:hAnsi="Times New Roman"/>
+          <w:b w:val="0"/>
+          <w:bCs w:val="0"/>
+          <w:i w:val="0"/>
+          <w:iCs w:val="0"/>
+          <w:sz w:val="22"/>
+          <w:szCs w:val="22"/>
+          <w:rtl w:val="1"/>
+        </w:rPr>
+        <w:t xml:space="preserve"> עם חיישן רטט פיאזואלקטרי המוצמד למסגרת הוולדות, מיקרופון </w:t>
+      </w:r>
+      <w:r>
+        <w:rPr>
+          <w:rFonts w:ascii="Times New Roman" w:cs="Times New Roman" w:eastAsia="Times New Roman" w:hAnsi="Times New Roman"/>
+          <w:b w:val="0"/>
+          <w:bCs w:val="0"/>
+          <w:i w:val="0"/>
+          <w:iCs w:val="0"/>
+          <w:sz w:val="22"/>
+          <w:szCs w:val="22"/>
+          <w:rtl w:val="0"/>
+        </w:rPr>
+        <w:t xml:space="preserve">MEMS</w:t>
+      </w:r>
+      <w:r>
+        <w:rPr>
+          <w:rFonts w:ascii="Times New Roman" w:cs="Times New Roman" w:eastAsia="Times New Roman" w:hAnsi="Times New Roman"/>
+          <w:b w:val="0"/>
+          <w:bCs w:val="0"/>
+          <w:i w:val="0"/>
+          <w:iCs w:val="0"/>
+          <w:sz w:val="22"/>
+          <w:szCs w:val="22"/>
+          <w:rtl w:val="1"/>
+        </w:rPr>
+        <w:t xml:space="preserve"> להשוואה, ארבעה תאי עומס מתחת לכוורת וחיישני טמפרטורה. הצומת מחשב בעצמו את ספקטרום תדרי הזמזום בתחום </w:t>
       </w:r>
       <w:r>
         <w:rPr>
@@ -1414,7 +1466,7 @@
           <w:szCs w:val="22"/>
           <w:rtl w:val="0"/>
         </w:rPr>
-        <w:t xml:space="preserve">1000</w:t>
+        <w:t xml:space="preserve">800</w:t>
       </w:r>
       <w:r>
         <w:rPr>
@@ -1427,20 +1479,20 @@
           <w:szCs w:val="22"/>
           <w:rtl w:val="1"/>
         </w:rPr>
-        <w:t xml:space="preserve"> הרץ ואת משקל הכוורת, ושולח תמצית קטנה של הנתונים בתקשורת </w:t>
-      </w:r>
-      <w:r>
-        <w:rPr>
-          <w:rFonts w:ascii="Times New Roman" w:cs="Times New Roman" w:eastAsia="Times New Roman" w:hAnsi="Times New Roman"/>
-          <w:b w:val="0"/>
-          <w:bCs w:val="0"/>
-          <w:i w:val="0"/>
-          <w:iCs w:val="0"/>
-          <w:sz w:val="22"/>
-          <w:szCs w:val="22"/>
-          <w:rtl w:val="0"/>
-        </w:rPr>
-        <w:t xml:space="preserve">LoRa</w:t>
+        <w:t xml:space="preserve"> הרץ ואת משקל הכוורת, ושולח תמצית קטנה של הנתונים בפרוטוקול </w:t>
+      </w:r>
+      <w:r>
+        <w:rPr>
+          <w:rFonts w:ascii="Times New Roman" w:cs="Times New Roman" w:eastAsia="Times New Roman" w:hAnsi="Times New Roman"/>
+          <w:b w:val="0"/>
+          <w:bCs w:val="0"/>
+          <w:i w:val="0"/>
+          <w:iCs w:val="0"/>
+          <w:sz w:val="22"/>
+          <w:szCs w:val="22"/>
+          <w:rtl w:val="0"/>
+        </w:rPr>
+        <w:t xml:space="preserve">ESP-NOW</w:t>
       </w:r>
       <w:r>
         <w:rPr>
@@ -1453,20 +1505,20 @@
           <w:szCs w:val="22"/>
           <w:rtl w:val="1"/>
         </w:rPr>
-        <w:t xml:space="preserve"> לשער (</w:t>
-      </w:r>
-      <w:r>
-        <w:rPr>
-          <w:rFonts w:ascii="Times New Roman" w:cs="Times New Roman" w:eastAsia="Times New Roman" w:hAnsi="Times New Roman"/>
-          <w:b w:val="0"/>
-          <w:bCs w:val="0"/>
-          <w:i w:val="0"/>
-          <w:iCs w:val="0"/>
-          <w:sz w:val="22"/>
-          <w:szCs w:val="22"/>
-          <w:rtl w:val="0"/>
-        </w:rPr>
-        <w:t xml:space="preserve">Gateway</w:t>
+        <w:t xml:space="preserve"> למרכזייה מבוססת </w:t>
+      </w:r>
+      <w:r>
+        <w:rPr>
+          <w:rFonts w:ascii="Times New Roman" w:cs="Times New Roman" w:eastAsia="Times New Roman" w:hAnsi="Times New Roman"/>
+          <w:b w:val="0"/>
+          <w:bCs w:val="0"/>
+          <w:i w:val="0"/>
+          <w:iCs w:val="0"/>
+          <w:sz w:val="22"/>
+          <w:szCs w:val="22"/>
+          <w:rtl w:val="0"/>
+        </w:rPr>
+        <w:t xml:space="preserve">ESP32-S3</w:t>
       </w:r>
       <w:r>
         <w:rPr>
@@ -1479,7 +1531,7 @@
           <w:szCs w:val="22"/>
           <w:rtl w:val="1"/>
         </w:rPr>
-        <w:t xml:space="preserve">) מרכזי בכוורן. בשער פועלים אלגוריתמים לזיהוי בריחת נחיל ולזיהוי חריגות המעידות על מצוקת המושבה, והנתונים וההתרעות מוצגים למגדל בממשק </w:t>
+        <w:t xml:space="preserve"> בכוורן. המרכזייה מוזנת מפאנל סולארי, מריצה אלגוריתמים לזיהוי בריחת נחיל ולזיהוי חריגות המעידות על מצוקת המושבה, ומעבירה את הנתונים דרך מודם סלולרי לממשק </w:t>
       </w:r>
       <w:r>
         <w:rPr>
@@ -1505,7 +1557,7 @@
           <w:szCs w:val="22"/>
           <w:rtl w:val="1"/>
         </w:rPr>
-        <w:t xml:space="preserve">. החדשנות היא שילוב של ניתוח רטט ספקטרלי עם מדידת משקל בצומת סוללתי בצריכת הספק נמוכה, לעומת מערכות מחקר הצורכות כמה וואטים מרשת החשמל, ומוצרים מסחריים המודדים משקל בלבד. נבחן את המערכת בכוורן פעיל לאורך עונת הנחילה באביב, ונמדוד את דיוק השקילה (יעד: </w:t>
+        <w:t xml:space="preserve"> ולהתרעות למגדל. החדשנות היא שילוב של ניתוח רטט ספקטרלי עם מדידת משקל בצומת סוללתי בצריכת הספק נמוכה, לעומת מערכות מחקר הצורכות כמה וואטים מרשת החשמל, ומוצרים מסחריים המודדים משקל בלבד. נבחן את המערכת בכוורן פעיל לאורך עונת הנחילה באביב, ונמדוד את דיוק השקילה (יעד: </w:t>
       </w:r>
       <w:r>
         <w:rPr>
@@ -1557,7 +1609,7 @@
           <w:szCs w:val="22"/>
           <w:rtl w:val="1"/>
         </w:rPr>
-        <w:t xml:space="preserve">), צריכת הזרם הממוצעת (יעד: מתחת למיליאמפר אחד, כלומר לפחות חצי שנה על סוללה), ודיוק (</w:t>
+        <w:t xml:space="preserve">), צריכת הזרם הממוצעת של הצומת (יעד: מתחת למיליאמפר אחד, כלומר לפחות חצי שנה על סוללה), ודיוק (</w:t>
       </w:r>
       <w:r>
         <w:rPr>
@@ -1672,20 +1724,20 @@
           <w:szCs w:val="22"/>
           <w:rtl w:val="1"/>
         </w:rPr>
-        <w:t xml:space="preserve"> האינטרנט של הדברים, ניטור כוורות, דבורת הדבש, חיישני רטט, עיבוד אותות, צפיפות הספק ספקטרלית, תאי עומס, מערכות משובצות בהספק נמוך, </w:t>
-      </w:r>
-      <w:r>
-        <w:rPr>
-          <w:rFonts w:ascii="Times New Roman" w:cs="Times New Roman" w:eastAsia="Times New Roman" w:hAnsi="Times New Roman"/>
-          <w:b w:val="0"/>
-          <w:bCs w:val="0"/>
-          <w:i w:val="0"/>
-          <w:iCs w:val="0"/>
-          <w:sz w:val="22"/>
-          <w:szCs w:val="22"/>
-          <w:rtl w:val="0"/>
-        </w:rPr>
-        <w:t xml:space="preserve">LoRa</w:t>
+        <w:t xml:space="preserve"> האינטרנט של הדברים, ניטור כוורות, דבורת הדבש, חיישן פיאזואלקטרי, עיבוד אותות, צפיפות הספק ספקטרלית, תאי עומס, מערכות משובצות בהספק נמוך, </w:t>
+      </w:r>
+      <w:r>
+        <w:rPr>
+          <w:rFonts w:ascii="Times New Roman" w:cs="Times New Roman" w:eastAsia="Times New Roman" w:hAnsi="Times New Roman"/>
+          <w:b w:val="0"/>
+          <w:bCs w:val="0"/>
+          <w:i w:val="0"/>
+          <w:iCs w:val="0"/>
+          <w:sz w:val="22"/>
+          <w:szCs w:val="22"/>
+          <w:rtl w:val="0"/>
+        </w:rPr>
+        <w:t xml:space="preserve">ESP32, ESP-NOW</w:t>
       </w:r>
       <w:r>
         <w:rPr>
@@ -1965,7 +2017,7 @@
           <w:szCs w:val="22"/>
           <w:rtl w:val="0"/>
         </w:rPr>
-        <w:t xml:space="preserve">Honeybees are essential crop pollinators, yet colonies are still checked mainly by opening the hive every week or two, and between visits the beekeeper does not know what happens inside. A swarm, for example, takes a large part of the colony away, and is often discovered only at the next visit. BeeSense is an Internet of Things (IoT) system for continuous hive monitoring. Each hive carries a battery-powered microcontroller node with an accelerometer (vibration sensor) attached to the brood frame, four load cells under the hive, and temperature and humidity sensors. The node computes the buzzing spectrum between 50 and 1000 Hz and the hive weight on board, and sends a compact summary over LoRa to a gateway at the apiary. The gateway runs algorithms that detect swarm departures and anomalies that indicate colony distress, and a web dashboard shows the data and alerts to the beekeeper. The innovation is the fusion of spectral vibration analysis and weight in a low-power battery node, compared with research systems that draw several watts from mains power and commercial products that measure weight only. We will evaluate the system at a working apiary through the spring swarming season and measure weighing accuracy (target: ±20 g), packet delivery ratio (target: above 95%), average current (target: below 1 mA, i.e. at least six months per charge), and event-level precision and recall for swarms and controlled events (target: above 90%). Early swarm prediction and diagnosis of specific diseases are exploratory directions, not committed outcomes of this project.</w:t>
+        <w:t xml:space="preserve">Honeybees are essential crop pollinators, yet colonies are still checked mainly by opening the hive every week or two, and between visits the beekeeper does not know what happens inside. A swarm, for example, takes a large part of the colony away, and is often discovered only at the next visit. BeeSense is an Internet of Things (IoT) system for continuous monitoring of hives at apiaries without mains power or network. Each hive carries a battery-powered ESP32-C3 node with a piezoelectric vibration sensor attached to the brood frame, a MEMS microphone for comparison, four load cells under the hive, and temperature sensors. The node computes the buzzing spectrum between 50 and 800 Hz and the hive weight on board, and sends a compact summary over ESP-NOW to an ESP32-S3 hub at the apiary. The solar-powered hub runs algorithms that detect swarm departures and anomalies that indicate colony distress, and forwards the data over a cellular modem to a web dashboard and alerts. The innovation is the fusion of spectral vibration analysis and weight in a low-power battery node, compared with research systems that draw several watts from mains power and commercial products that measure weight only. We will evaluate the system at a working apiary through the spring swarming season and measure weighing accuracy (target: ±20 g), packet delivery ratio (target: above 95%), average node current (target: below 1 mA, i.e. at least six months per charge), and event-level precision and recall for swarms and controlled events (target: above 90%). Early swarm prediction and diagnosis of specific diseases are exploratory directions, not committed outcomes of this project.</w:t>
       </w:r>
     </w:p>
     <w:p>
@@ -2006,7 +2058,7 @@
           <w:szCs w:val="22"/>
           <w:rtl w:val="0"/>
         </w:rPr>
-        <w:t xml:space="preserve"> Internet of Things, Hive Monitoring, Honeybees, Vibration Sensing, Signal Processing, Power Spectral Density, Load Cells, Low-Power Embedded Systems, LoRa, Anomaly Detection.</w:t>
+        <w:t xml:space="preserve"> Internet of Things, Hive Monitoring, Honeybees, Vibration Sensing, Signal Processing, Power Spectral Density, Load Cells, Low-Power Embedded Systems, ESP32, ESP-NOW, Anomaly Detection.</w:t>
       </w:r>
     </w:p>
     <w:p>
@@ -2105,7 +2157,7 @@
           <w:szCs w:val="22"/>
           <w:rtl w:val="0"/>
         </w:rPr>
-        <w:t xml:space="preserve">Honeybee colonies are inspected mostly by opening the hive every one to two weeks; inspections disturb the colony, cost labour, and leave the beekeeper blind between visits. Precision beekeeping, i.e. monitoring colonies with sensors so that interventions are based on data, was proposed to close this gap [1]. Hive vibrations change measurably before swarming [2], [3], and continuous hive weight reveals foraging, consumption and swarm departures [4]. Initial use case: a beekeeper with tens of Langstroth hives at a remote apiary without mains power, visiting weekly. The system must alert when a swarm leaves or a colony behaves abnormally, and show which hives need a visit first. Applications: commercial and hobby apiaries, pollination services, and research apiaries that need long continuous records.</w:t>
+        <w:t xml:space="preserve">Honeybee colonies are inspected mostly by opening the hive every one to two weeks; inspections disturb the colony, cost labour, and leave the beekeeper blind between visits. Precision beekeeping, i.e. monitoring colonies with sensors so that interventions are based on data, was proposed to close this gap [1]. Hive vibrations change measurably before swarming [2], [3], and continuous hive weight reveals foraging, consumption and swarm departures [4]. Initial use case: a beekeeper with many Langstroth hives standing close together at a remote apiary without mains power or Wi-Fi, visiting weekly. The system must alert when a swarm leaves or a colony behaves abnormally, and show which hives need a visit first. Applications: commercial and hobby apiaries, pollination services, and research apiaries that need long continuous records.</w:t>
       </w:r>
     </w:p>
     <w:p>
@@ -2220,7 +2272,7 @@
           <w:szCs w:val="22"/>
           <w:rtl w:val="0"/>
         </w:rPr>
-        <w:t xml:space="preserve">(2) a reliable LoRa link from several hives to a gateway, with a database and a web dashboard;</w:t>
+        <w:t xml:space="preserve">(2) a reliable short-range link from the hives to a solar-powered hub with a cellular uplink, a cloud database and a web dashboard;</w:t>
       </w:r>
     </w:p>
     <w:p>
@@ -2297,7 +2349,7 @@
           <w:szCs w:val="22"/>
           <w:rtl w:val="0"/>
         </w:rPr>
-        <w:t xml:space="preserve">(1) define requirements with a cooperating beekeeper; bench-test the vibration chain (known tones) and the weighing chain (reference masses).</w:t>
+        <w:t xml:space="preserve">(1) define requirements with the cooperating beekeeper; bench-test the piezo chain (known tones), the weighing chain (reference masses) and the FFT time on the ESP32-C3.</w:t>
       </w:r>
     </w:p>
     <w:p>
@@ -2320,7 +2372,7 @@
           <w:szCs w:val="22"/>
           <w:rtl w:val="0"/>
         </w:rPr>
-        <w:t xml:space="preserve">(2) build the node: acquisition, on-board spectrum, power modes; compare candidate vibration sensors; bring up the LoRa link and gateway.</w:t>
+        <w:t xml:space="preserve">(2) build the node: acquisition, on-board spectrum, power modes; compare piezo and microphone; measure ESP-NOW range at the apiary.</w:t>
       </w:r>
     </w:p>
     <w:p>
@@ -2343,7 +2395,7 @@
           <w:szCs w:val="22"/>
           <w:rtl w:val="0"/>
         </w:rPr>
-        <w:t xml:space="preserve">(3) implement the database, detection algorithms and dashboard; install on hives before the spring swarming season.</w:t>
+        <w:t xml:space="preserve">(3) build the hub (cellular uplink, solar power, buffering), database, detection and dashboard; install on hives before the spring swarming season.</w:t>
       </w:r>
     </w:p>
     <w:p>
@@ -2413,7 +2465,7 @@
           <w:szCs w:val="22"/>
           <w:rtl w:val="0"/>
         </w:rPr>
-        <w:t xml:space="preserve">Each hive node uses a low-power microcontroller (MCU) with a floating-point unit (candidate: ESP32-S3) and a sub-GHz LoRa transceiver (SX1262 class; frequency plan per Israeli regulation). Vibration is measured by a low-noise MEMS accelerometer attached to the central brood frame, as in [3] (candidate: ADXL355, output rate up to 4 kHz); a MEMS microphone and a piezo disc are benchmarked as alternatives in Stage 2. Weight: four 50 kg load cells under a hive platform, read by an HX711 24-bit bridge ADC. In-hive temperature (DS18B20) and outside temperature and humidity (BME280). Power: two 18650 Li-ion cells and an optional small solar panel. Interfaces: SPI (accelerometer), two-wire serial (HX711), 1-Wire and I²C (environment), LoRa to a Raspberry Pi gateway, Wi-Fi or cellular backhaul, and a dashboard in a web browser. Our contribution is a battery-powered node that reduces raw vibration to spectral features inside the hive and fuses them with weight to detect colony events, with measured accuracy, link reliability and energy.</w:t>
+        <w:t xml:space="preserve">Each hive node uses an ESP32-C3 SuperMini (RISC-V, 160 MHz, Wi-Fi radio, no floating-point unit). The main vibration sensor is a 27 mm piezo disc glued to the brood frame: like the accelerometers in [3] it senses comb vibration, with less wind and outside noise than a microphone. An op-amp preamplifier buffers and biases the disc, protects the ADC and is the anti-aliasing low-pass (≈800 Hz). An I²S MEMS microphone is a comparison channel. Weight: four 50 kg half-bridge load cells under a hive platform and an HX711 24-bit ADC; temperature: DS18B20 probes. Power: one 18650 cell and a low-quiescent LDO. Nodes report over ESP-NOW, a connectionless protocol on the Wi-Fi radio, to an ESP32-S3 hub serving a group of nearby hives; the hub uploads over a cellular modem and runs from an 18 V / 15 W solar panel, an MPPT charger and a Li-ion pack. As the hives stand close together, one SIM per hub replaces a LoRa radio or a SIM in every hive. Our contribution is a battery-powered node that reduces raw vibration to spectral features inside the hive and fuses them with weight to detect colony events, with measured accuracy, link reliability and energy.</w:t>
       </w:r>
       <w:r>
         <w:rPr>
@@ -2435,7 +2487,7 @@
         </w:rPr>
         <w:drawing>
           <wp:inline distB="0" distT="0" distL="114300" distR="114300">
-            <wp:extent cx="5760720" cy="1960245"/>
+            <wp:extent cx="5577840" cy="1975485"/>
             <wp:effectExtent b="0" l="0" r="0" t="0"/>
             <wp:docPr id="6" name="image1.png"/>
             <a:graphic>
@@ -2455,7 +2507,7 @@
                   <pic:spPr>
                     <a:xfrm>
                       <a:off x="0" y="0"/>
-                      <a:ext cx="5760720" cy="1960245"/>
+                      <a:ext cx="5577840" cy="1975485"/>
                     </a:xfrm>
                     <a:prstGeom prst="rect"/>
                     <a:ln/>
@@ -2539,7 +2591,7 @@
           <w:szCs w:val="22"/>
           <w:rtl w:val="0"/>
         </w:rPr>
-        <w:t xml:space="preserve">Ferrari et al. recorded hive sounds with in-hive microphones and found that the power spectral density near 110 Hz rises, and shifts upward in frequency, before swarming [2]. Ramsey et al. placed accelerometers in the heart of the colony and, by tracking how the vibrational spectra evolve, separated colonies preparing to swarm with more than 90% accuracy, up to 30 days ahead [3]. Cecchi et al. built a multi-sensor hive with microphones, weighing to ±10 g and CO₂, but each hive used a Raspberry Pi drawing about 4 W from mains power [5]. Commercially, BroodMinder hive scales log weight only [6], and BeeHero in-hive sensors measure acoustics and climate and report over Bluetooth Low Energy to a cellular gateway in a closed system [7] (Table I). We chose a frame-mounted accelerometer over an air microphone because it couples directly to the comb and is less sensitive to wind and outside noise.</w:t>
+        <w:t xml:space="preserve">Ferrari et al. recorded hive sounds with in-hive microphones and found that the power spectral density near 110 Hz rises, and shifts upward in frequency, before swarming [2]. Ramsey et al. placed accelerometers in the heart of the colony and, by tracking how the vibrational spectra evolve, separated colonies preparing to swarm with more than 90% accuracy, up to 30 days ahead [3]. Cecchi et al. built a multi-sensor hive with microphones, weighing to ±10 g and CO₂, but each hive used a Raspberry Pi drawing about 4 W from mains power [5]. Commercially, BroodMinder hive scales log weight only [6], and BeeHero in-hive sensors measure acoustics and climate and report over Bluetooth Low Energy to a cellular gateway in a closed system [7] (Table I). Like BeeHero, we use a short-range link inside the apiary and one cellular uplink, but with open, measured processing and weight fusion.</w:t>
       </w:r>
     </w:p>
     <w:p>
@@ -2951,7 +3003,7 @@
                 <w:szCs w:val="18"/>
                 <w:rtl w:val="0"/>
               </w:rPr>
-              <w:t xml:space="preserve">In-hive acoustics and climate, BLE + cellular</w:t>
+              <w:t xml:space="preserve">In-hive acoustics and climate, BLE + cellular gateway</w:t>
             </w:r>
           </w:p>
         </w:tc>
@@ -2974,7 +3026,7 @@
                 <w:szCs w:val="18"/>
                 <w:rtl w:val="0"/>
               </w:rPr>
-              <w:t xml:space="preserve">Open, measured pipeline; weight fusion</w:t>
+              <w:t xml:space="preserve">Open, measured pipeline; weight + vibration fusion</w:t>
             </w:r>
           </w:p>
         </w:tc>
@@ -3053,7 +3105,7 @@
           <w:szCs w:val="22"/>
           <w:rtl w:val="0"/>
         </w:rPr>
-        <w:t xml:space="preserve">Every reporting interval </w:t>
+        <w:t xml:space="preserve">Every interval </w:t>
       </w:r>
       <w:r>
         <w:rPr>
@@ -3133,7 +3185,7 @@
           <w:szCs w:val="22"/>
           <w:rtl w:val="0"/>
         </w:rPr>
-        <w:t xml:space="preserve"> = 10 s of vibration at </w:t>
+        <w:t xml:space="preserve"> = 10 s of piezo signal at </w:t>
       </w:r>
       <w:r>
         <w:rPr>
@@ -3173,7 +3225,7 @@
           <w:szCs w:val="22"/>
           <w:rtl w:val="0"/>
         </w:rPr>
-        <w:t xml:space="preserve"> = 4 kHz, and averages the weight over 1 s at 10 samples/s. The power spectral density </w:t>
+        <w:t xml:space="preserve"> = 2 kHz (ADC with DMA) and averages the weight over 1 s. The power spectral density </w:t>
       </w:r>
       <w:r>
         <w:rPr>
@@ -3225,7 +3277,7 @@
           <w:szCs w:val="22"/>
           <w:rtl w:val="0"/>
         </w:rPr>
-        <w:t xml:space="preserve">) is estimated with Welch's method (4096-point Hann windows, 50% overlap, Δ</w:t>
+        <w:t xml:space="preserve">) is estimated with Welch's method (1024-point Hann windows, 50% overlap, Δ</w:t>
       </w:r>
       <w:r>
         <w:rPr>
@@ -3291,7 +3343,7 @@
           <w:szCs w:val="22"/>
           <w:rtl w:val="0"/>
         </w:rPr>
-        <w:t xml:space="preserve">/4096 ≈ 0.98 Hz) and reduced to </w:t>
+        <w:t xml:space="preserve">/1024 ≈ 1.95 Hz) using a fixed-point FFT, since the ESP32-C3 has no floating-point unit, and reduced to </w:t>
       </w:r>
       <w:r>
         <w:rPr>
@@ -3383,7 +3435,7 @@
           <w:szCs w:val="22"/>
           <w:rtl w:val="0"/>
         </w:rPr>
-        <w:t xml:space="preserve"> = 50–1000 Hz, which covers the swarming band reported in [2]. Relative band energies cancel the sensor coupling and gain:</w:t>
+        <w:t xml:space="preserve"> = 50–800 Hz, which covers the swarming band reported in [2]. Relative band energies cancel the sensor coupling and gain:</w:t>
       </w:r>
     </w:p>
     <w:p>
@@ -4063,7 +4115,7 @@
           <w:szCs w:val="22"/>
           <w:rtl w:val="0"/>
         </w:rPr>
-        <w:t xml:space="preserve">Each ≈50-byte payload (24 band energies, total vibration power, weight, temperatures, battery voltage) is sent over LoRa. Since colony activity follows a daily cycle [4], the gateway compares each feature </w:t>
+        <w:t xml:space="preserve">Each ≈50-byte payload (24 band energies, total vibration power, weight, temperatures, battery voltage) is sent over ESP-NOW. Since colony activity follows a daily cycle [4], the hub compares each feature </w:t>
       </w:r>
       <w:r>
         <w:rPr>
@@ -4327,7 +4379,7 @@
           <w:szCs w:val="22"/>
           <w:rtl w:val="0"/>
         </w:rPr>
-        <w:t xml:space="preserve"> = 0.8 kg is an initial value, tuned on data (thresholds are initial values). Rain, feeding and inspections also change weight: inspections are logged in the dashboard and excluded, and an empty-hive control platform separates environmental drift [4]. On an anomaly the node also sends the full-resolution spectrum (≈1 kB, several packets). Swarm-preparation indicators, following the spectral-trend approach of [3], are studied offline against inspection records.</w:t>
+        <w:t xml:space="preserve"> = 0.8 kg is an initial value, tuned on data. Logged inspections are excluded, and an empty-hive control platform separates rain and drift [4]. On an anomaly the node also sends the full spectrum. Swarm-preparation indicators, following the spectral-trend approach of [3], are studied offline against inspection records.</w:t>
       </w:r>
     </w:p>
     <w:p>
@@ -4374,7 +4426,7 @@
           <w:szCs w:val="22"/>
           <w:rtl w:val="0"/>
         </w:rPr>
-        <w:t xml:space="preserve">There is no prototype yet, so feasibility is shown by analysis from datasheet values; each number below will be replaced by a bench measurement in Stage 2. </w:t>
+        <w:t xml:space="preserve">The parts are in hand but no node is built yet, so feasibility is shown from datasheet values, each to be replaced by a bench measurement. </w:t>
       </w:r>
       <w:r>
         <w:rPr>
@@ -4400,7 +4452,7 @@
           <w:szCs w:val="22"/>
           <w:rtl w:val="0"/>
         </w:rPr>
-        <w:t xml:space="preserve"> raw vibration is 4000 samples/s × 2 bytes = 8 kB/s (≈690 MB per hive per day), far beyond a LoRa link; on-board features reduce it to ≈50 bytes per 10 min (≈7 kB/day). </w:t>
+        <w:t xml:space="preserve"> raw piezo data is 2000 samples/s × 2 bytes = 4 kB/s (≈350 MB per hive per day); on-board features reduce it to ≈50 bytes per 10 min (≈7 kB/day), one ESP-NOW frame (≤250 bytes [8]); 20 hives need only ≈4 MB/month of cellular data. </w:t>
       </w:r>
       <w:r>
         <w:rPr>
@@ -4426,7 +4478,7 @@
           <w:szCs w:val="22"/>
           <w:rtl w:val="0"/>
         </w:rPr>
-        <w:t xml:space="preserve"> at spreading factor SF9, 125 kHz bandwidth and coding rate 4/5, a 50-byte packet takes ≈0.39 s of air time [8], 0.07% of a 10-min interval; even SF12 (≈2.3 s) stays below 0.4%. </w:t>
+        <w:t xml:space="preserve"> ESP-NOW runs at 1 Mbps with a MAC-level acknowledgement [8]; we add sequence numbers and retries. Wood, honey and bees attenuate 2.4 GHz, so the radio sits outside the hive body; range with the small SuperMini antenna is the main link risk, measured on site first (fallback: LoRa on SPI). </w:t>
       </w:r>
       <w:r>
         <w:rPr>
@@ -4465,7 +4517,7 @@
           <w:szCs w:val="22"/>
           <w:rtl w:val="0"/>
         </w:rPr>
-        <w:t xml:space="preserve">Power:</w:t>
+        <w:t xml:space="preserve">Node power:</w:t>
       </w:r>
       <w:r>
         <w:rPr>
@@ -4913,7 +4965,7 @@
           <w:szCs w:val="22"/>
           <w:rtl w:val="0"/>
         </w:rPr>
-        <w:t xml:space="preserve">With estimates of 40 mA for the MCU during the 10.4 s of acquisition and FFT, 120 mA for 0.39 s of LoRa transmission, 1.5 mA for the HX711, 0.2 mA for the accelerometer and 20 µA in deep sleep, </w:t>
+        <w:t xml:space="preserve">With 22 mA for the CPU at 80 MHz during the 10 s recording and 28 mA at 160 MHz for ≈1 s of FFT (datasheet values [10]; FFT time to be measured), 0.15 s of radio at ≈120 mA average (335 mA TX peak [10]), 1.5 mA (HX711), 0.1 mA (preamplifier) and 20 µA in deep sleep (5 µA chip [10] plus LDO and leakage), </w:t>
       </w:r>
       <w:r>
         <w:rPr>
@@ -4939,7 +4991,7 @@
           <w:szCs w:val="22"/>
           <w:rtl w:val="0"/>
         </w:rPr>
-        <w:t xml:space="preserve"> ≈ 0.8 mA at </w:t>
+        <w:t xml:space="preserve"> ≈ 0.47 mA at </w:t>
       </w:r>
       <w:r>
         <w:rPr>
@@ -4979,7 +5031,7 @@
           <w:szCs w:val="22"/>
           <w:rtl w:val="0"/>
         </w:rPr>
-        <w:t xml:space="preserve"> = 10 min; with two 3000 mAh cells in parallel and usable fraction </w:t>
+        <w:t xml:space="preserve"> = 10 min; one 3000 mAh cell with usable fraction </w:t>
       </w:r>
       <w:r>
         <w:rPr>
@@ -5005,7 +5057,7 @@
           <w:szCs w:val="22"/>
           <w:rtl w:val="0"/>
         </w:rPr>
-        <w:t xml:space="preserve"> = 0.8, </w:t>
+        <w:t xml:space="preserve"> = 0.8 gives </w:t>
       </w:r>
       <w:r>
         <w:rPr>
@@ -5045,7 +5097,7 @@
           <w:szCs w:val="22"/>
           <w:rtl w:val="0"/>
         </w:rPr>
-        <w:t xml:space="preserve"> ≈ 250 days (Fig. 2). The MCU active time is ≈87% of the charge, so the record length </w:t>
+        <w:t xml:space="preserve"> ≈ 210 days (Fig. 2). The CPU is ≈88% of the charge, so the record length </w:t>
       </w:r>
       <w:r>
         <w:rPr>
@@ -5085,7 +5137,33 @@
           <w:szCs w:val="22"/>
           <w:rtl w:val="0"/>
         </w:rPr>
-        <w:t xml:space="preserve"> and the FFT implementation are the main design levers. Summer heat under the hive lid can exceed Li-ion charging limits, so the enclosure is shaded and charging is cut off by temperature.</w:t>
+        <w:t xml:space="preserve"> and the FFT speed are the main design levers. </w:t>
+      </w:r>
+      <w:r>
+        <w:rPr>
+          <w:rFonts w:ascii="Times New Roman" w:cs="Times New Roman" w:eastAsia="Times New Roman" w:hAnsi="Times New Roman"/>
+          <w:b w:val="0"/>
+          <w:bCs w:val="0"/>
+          <w:i w:val="1"/>
+          <w:iCs w:val="1"/>
+          <w:sz w:val="22"/>
+          <w:szCs w:val="22"/>
+          <w:rtl w:val="0"/>
+        </w:rPr>
+        <w:t xml:space="preserve">Hub power:</w:t>
+      </w:r>
+      <w:r>
+        <w:rPr>
+          <w:rFonts w:ascii="Times New Roman" w:cs="Times New Roman" w:eastAsia="Times New Roman" w:hAnsi="Times New Roman"/>
+          <w:b w:val="0"/>
+          <w:bCs w:val="0"/>
+          <w:i w:val="0"/>
+          <w:iCs w:val="0"/>
+          <w:sz w:val="22"/>
+          <w:szCs w:val="22"/>
+          <w:rtl w:val="0"/>
+        </w:rPr>
+        <w:t xml:space="preserve"> listening continuously (≈100 mA receive) plus the modem, the hub draws ≈0.5 W (≈12 Wh/day), against ≈45 Wh/day from the panel (5 full-sun hours, 60% conversion); three 18650 cells cover two days without sun. Enclosures are shaded and charging is cut off by temperature in summer heat.</w:t>
       </w:r>
     </w:p>
     <w:p>
@@ -5105,7 +5183,7 @@
         </w:rPr>
         <w:drawing>
           <wp:inline distB="0" distT="0" distL="114300" distR="114300">
-            <wp:extent cx="5760720" cy="1600200"/>
+            <wp:extent cx="5120640" cy="1422400"/>
             <wp:effectExtent b="0" l="0" r="0" t="0"/>
             <wp:docPr id="5" name="image3.png"/>
             <a:graphic>
@@ -5125,7 +5203,7 @@
                   <pic:spPr>
                     <a:xfrm>
                       <a:off x="0" y="0"/>
-                      <a:ext cx="5760720" cy="1600200"/>
+                      <a:ext cx="5120640" cy="1422400"/>
                     </a:xfrm>
                     <a:prstGeom prst="rect"/>
                     <a:ln/>
@@ -5162,7 +5240,7 @@
           <w:szCs w:val="18"/>
           <w:rtl w:val="0"/>
         </w:rPr>
-        <w:t xml:space="preserve">Fig. 2.  Estimated battery life vs. reporting interval by (3), for three vibration record lengths (datasheet-level estimates, to be measured).</w:t>
+        <w:t xml:space="preserve">Fig. 2.  Estimated node battery life (one 18650 cell) vs. reporting interval by (3), for three record lengths (datasheet-level estimates, to be measured).</w:t>
       </w:r>
     </w:p>
     <w:p>
@@ -5222,7 +5300,7 @@
           <w:szCs w:val="22"/>
           <w:rtl w:val="0"/>
         </w:rPr>
-        <w:t xml:space="preserve"> weighing linearity and repeatability with reference masses from 0 to 100 kg and a temperature sweep; the vibration chain is checked with known tones (100–1000 Hz) from a speaker or shaker coupled to a frame; average current is measured with a power analyser over full cycles. </w:t>
+        <w:t xml:space="preserve"> weighing linearity and repeatability with reference masses from 0 to 100 kg and a temperature sweep; the vibration chain is checked with known tones (100–800 Hz) from a speaker or shaker coupled to a frame; average current is measured with a power analyser over full cycles. </w:t>
       </w:r>
       <w:r>
         <w:rPr>
@@ -5302,7 +5380,7 @@
           <w:szCs w:val="22"/>
           <w:rtl w:val="0"/>
         </w:rPr>
-        <w:t xml:space="preserve">, from installation through the spring swarming season. Ground truth: weekly inspection records (queen cells, brood, queen presence), beekeeper reports and, where possible, an entrance camera to time swarm departures. Natural swarms are rare, so detection is also tested with controlled events, removal of known masses (0.5–2 kg) and short disturbances, scheduled without the detector settings being changed. Each alert matches at most one labelled event within ±30 min, giving precision </w:t>
+        <w:t xml:space="preserve">, from installation through the spring swarming season. Ground truth: weekly inspection records (queen cells, brood, queen presence), beekeeper reports and, where possible, an entrance camera to time swarm departures. Natural swarms are rare, so detection is also tested with controlled events: removal of known masses (0.5–2 kg) and short disturbances. Each alert matches at most one labelled event within ±30 min, giving precision </w:t>
       </w:r>
       <w:r>
         <w:rPr>
@@ -5354,7 +5432,7 @@
           <w:szCs w:val="22"/>
           <w:rtl w:val="0"/>
         </w:rPr>
-        <w:t xml:space="preserve"> = TP/(TP+FN); false alarms are reported per hive-week. Thresholds are tuned on the first weeks and frozen before the evaluation period. The packet delivery ratio (PDR) is computed from sequence numbers at each hive's distance from the gateway.</w:t>
+        <w:t xml:space="preserve"> = TP/(TP+FN); false alarms are reported per hive-week. Thresholds are tuned on the first weeks and frozen before the evaluation period. The packet delivery ratio (PDR) is computed from sequence numbers for every hive, and the hub logs its battery voltage to check the solar energy balance.</w:t>
       </w:r>
     </w:p>
     <w:p>
@@ -5644,7 +5722,7 @@
                 <w:szCs w:val="20"/>
                 <w:rtl w:val="0"/>
               </w:rPr>
-              <w:t xml:space="preserve">Tone frequency error, 100–1000 Hz</w:t>
+              <w:t xml:space="preserve">Tone frequency error, 100–800 Hz</w:t>
             </w:r>
           </w:p>
         </w:tc>
@@ -5895,7 +5973,7 @@
                 <w:szCs w:val="20"/>
                 <w:rtl w:val="0"/>
               </w:rPr>
-              <w:t xml:space="preserve">Packet delivery ratio at apiary distance</w:t>
+              <w:t xml:space="preserve">Packet delivery ratio, hive to hub (ESP-NOW)</w:t>
             </w:r>
           </w:p>
         </w:tc>
@@ -5975,7 +6053,7 @@
                 <w:szCs w:val="20"/>
                 <w:rtl w:val="0"/>
               </w:rPr>
-              <w:t xml:space="preserve">Average current; unattended operation</w:t>
+              <w:t xml:space="preserve">Node average current; unattended run on solar hub</w:t>
             </w:r>
           </w:p>
         </w:tc>
@@ -6588,7 +6666,33 @@
           <w:szCs w:val="20"/>
           <w:rtl w:val="0"/>
         </w:rPr>
-        <w:t xml:space="preserve">Semtech Corp., "LoRa modem designer's guide," Application Note AN1200.13, Jul. 2013.</w:t>
+        <w:t xml:space="preserve">Espressif Systems, "ESP-NOW," in </w:t>
+      </w:r>
+      <w:r>
+        <w:rPr>
+          <w:rFonts w:ascii="Times New Roman" w:cs="Times New Roman" w:eastAsia="Times New Roman" w:hAnsi="Times New Roman"/>
+          <w:b w:val="0"/>
+          <w:bCs w:val="0"/>
+          <w:i w:val="1"/>
+          <w:iCs w:val="1"/>
+          <w:sz w:val="20"/>
+          <w:szCs w:val="20"/>
+          <w:rtl w:val="0"/>
+        </w:rPr>
+        <w:t xml:space="preserve">ESP-IDF Programming Guide (ESP32-C3), v5.3.2</w:t>
+      </w:r>
+      <w:r>
+        <w:rPr>
+          <w:rFonts w:ascii="Times New Roman" w:cs="Times New Roman" w:eastAsia="Times New Roman" w:hAnsi="Times New Roman"/>
+          <w:b w:val="0"/>
+          <w:bCs w:val="0"/>
+          <w:i w:val="0"/>
+          <w:iCs w:val="0"/>
+          <w:sz w:val="20"/>
+          <w:szCs w:val="20"/>
+          <w:rtl w:val="0"/>
+        </w:rPr>
+        <w:t xml:space="preserve">. [Online]. Available: https://docs.espressif.com/projects/esp-idf/en/v5.3.2/esp32c3/api-reference/network/esp_now.html</w:t>
       </w:r>
     </w:p>
     <w:p>
@@ -6642,6 +6746,59 @@
           <w:rtl w:val="0"/>
         </w:rPr>
         <w:t xml:space="preserve">Avia Semiconductor, "HX711: 24-bit analog-to-digital converter (ADC) for weigh scales," datasheet.</w:t>
+      </w:r>
+    </w:p>
+    <w:p>
+      <w:pPr>
+        <w:tabs>
+          <w:tab w:val="left" w:leader="none" w:pos="510"/>
+        </w:tabs>
+        <w:spacing w:after="80" w:before="0" w:line="240" w:lineRule="auto"/>
+        <w:ind w:left="510" w:hanging="510"/>
+        <w:jc w:val="left"/>
+        <w:rPr>
+          <w:sz w:val="22"/>
+          <w:szCs w:val="22"/>
+        </w:rPr>
+      </w:pPr>
+      <w:r>
+        <w:rPr>
+          <w:rFonts w:ascii="Times New Roman" w:cs="Times New Roman" w:eastAsia="Times New Roman" w:hAnsi="Times New Roman"/>
+          <w:b w:val="0"/>
+          <w:bCs w:val="0"/>
+          <w:i w:val="0"/>
+          <w:iCs w:val="0"/>
+          <w:sz w:val="20"/>
+          <w:szCs w:val="20"/>
+          <w:rtl w:val="0"/>
+        </w:rPr>
+        <w:t xml:space="preserve">[10]</w:t>
+      </w:r>
+      <w:r>
+        <w:rPr>
+          <w:rFonts w:ascii="Times New Roman" w:cs="Times New Roman" w:eastAsia="Times New Roman" w:hAnsi="Times New Roman"/>
+          <w:b w:val="0"/>
+          <w:bCs w:val="0"/>
+          <w:i w:val="0"/>
+          <w:iCs w:val="0"/>
+          <w:sz w:val="20"/>
+          <w:szCs w:val="20"/>
+          <w:rtl w:val="0"/>
+        </w:rPr>
+        <w:tab/>
+      </w:r>
+      <w:r>
+        <w:rPr>
+          <w:rFonts w:ascii="Times New Roman" w:cs="Times New Roman" w:eastAsia="Times New Roman" w:hAnsi="Times New Roman"/>
+          <w:b w:val="0"/>
+          <w:bCs w:val="0"/>
+          <w:i w:val="0"/>
+          <w:iCs w:val="0"/>
+          <w:sz w:val="20"/>
+          <w:szCs w:val="20"/>
+          <w:rtl w:val="0"/>
+        </w:rPr>
+        <w:t xml:space="preserve">Espressif Systems, "ESP32-C3 series datasheet," [Online]. Available: https://www.espressif.com/en/support/documents/technical-documents</w:t>
       </w:r>
     </w:p>
     <w:p>

</xml_diff>

<commit_message>
vault backup: 2026-10-25 15:22:11
</commit_message>
<xml_diff>
--- a/docs/pdr-2027-xxx.docx
+++ b/docs/pdr-2027-xxx.docx
@@ -1349,7 +1349,7 @@
           <w:szCs w:val="22"/>
           <w:rtl w:val="1"/>
         </w:rPr>
-        <w:t xml:space="preserve">דבורי הדבש חיוניות להאבקת גידולים חקלאיים, אך מצב הכוורת נבדק כיום בעיקר בפתיחה ידנית ותקופתית שלה, ובין ביקור לביקור המגדל אינו יודע מה מתרחש בכוורת. בריחת נחיל, למשל, גורמת לאובדן של חלק ניכר מאוכלוסיית המושבה, ולעיתים קרובות המגדל מגלה זאת רק בביקור הבא. בי-סנס היא מערכת </w:t>
+        <w:t xml:space="preserve">דבורי הדבש חיוניות להאבקת גידולים חקלאיים, אך מצב הכוורת נבדק כיום בעיקר בפתיחה ידנית ותקופתית שלה, ובין ביקור לביקור המגדל אינו יודע מה מתרחש בכוורת. הכנה לבריחת נחיל נמשכת כשבוע עד שבועיים, והנחיל עצמו, שלוקח איתו חלק ניכר מאוכלוסיית המושבה, עוזב תוך דקות ולעיתים קרובות מתגלה רק בביקור הבא. בי-סנס היא מערכת </w:t>
       </w:r>
       <w:r>
         <w:rPr>
@@ -1375,7 +1375,7 @@
           <w:szCs w:val="22"/>
           <w:rtl w:val="1"/>
         </w:rPr>
-        <w:t xml:space="preserve"> לניטור רציף של כוורות דבורים בכוורן ללא חשמל וללא רשת. בכל כוורת מותקן צומת סוללתי מבוסס </w:t>
+        <w:t xml:space="preserve"> לניטור רציף של כוורות בכוורן ללא חשמל וללא רשת. בכל כוורת מותקן צומת סוללתי מבוסס </w:t>
       </w:r>
       <w:r>
         <w:rPr>
@@ -1401,20 +1401,20 @@
           <w:szCs w:val="22"/>
           <w:rtl w:val="1"/>
         </w:rPr>
-        <w:t xml:space="preserve"> עם חיישן רטט פיאזואלקטרי המוצמד לאחת המסגרות שבמרכז הכוורת, מיקרופון </w:t>
-      </w:r>
-      <w:r>
-        <w:rPr>
-          <w:rFonts w:ascii="Times New Roman" w:cs="Times New Roman" w:eastAsia="Times New Roman" w:hAnsi="Times New Roman"/>
-          <w:b w:val="0"/>
-          <w:bCs w:val="0"/>
-          <w:i w:val="0"/>
-          <w:iCs w:val="0"/>
-          <w:sz w:val="22"/>
-          <w:szCs w:val="22"/>
-          <w:rtl w:val="0"/>
-        </w:rPr>
-        <w:t xml:space="preserve">MEMS</w:t>
+        <w:t xml:space="preserve">. חיישן רטט פיאזואלקטרי, הנעוץ בחלה שבמרכז הכוורת, מאזין ברציפות בצריכה של ננו-אמפרים ומעיר את הצומת כשהרטט חורג מרמת הרקע; בכל השכמה, וגם במדידה מחזורית כל רבע שעה, הצומת מקליט מהפיאזו וממיקרופון דיגיטלי זעיר, מחשב את ספקטרום התדרים בתחום </w:t>
+      </w:r>
+      <w:r>
+        <w:rPr>
+          <w:rFonts w:ascii="Times New Roman" w:cs="Times New Roman" w:eastAsia="Times New Roman" w:hAnsi="Times New Roman"/>
+          <w:b w:val="0"/>
+          <w:bCs w:val="0"/>
+          <w:i w:val="0"/>
+          <w:iCs w:val="0"/>
+          <w:sz w:val="22"/>
+          <w:szCs w:val="22"/>
+          <w:rtl w:val="0"/>
+        </w:rPr>
+        <w:t xml:space="preserve">50</w:t>
       </w:r>
       <w:r>
         <w:rPr>
@@ -1427,20 +1427,20 @@
           <w:szCs w:val="22"/>
           <w:rtl w:val="1"/>
         </w:rPr>
-        <w:t xml:space="preserve"> להשוואה, ארבעה תאי עומס מתחת לכוורת וחיישני טמפרטורה. הצומת מחשב בעצמו את ספקטרום תדרי הזמזום בתחום </w:t>
-      </w:r>
-      <w:r>
-        <w:rPr>
-          <w:rFonts w:ascii="Times New Roman" w:cs="Times New Roman" w:eastAsia="Times New Roman" w:hAnsi="Times New Roman"/>
-          <w:b w:val="0"/>
-          <w:bCs w:val="0"/>
-          <w:i w:val="0"/>
-          <w:iCs w:val="0"/>
-          <w:sz w:val="22"/>
-          <w:szCs w:val="22"/>
-          <w:rtl w:val="0"/>
-        </w:rPr>
-        <w:t xml:space="preserve">50</w:t>
+        <w:t xml:space="preserve"> עד </w:t>
+      </w:r>
+      <w:r>
+        <w:rPr>
+          <w:rFonts w:ascii="Times New Roman" w:cs="Times New Roman" w:eastAsia="Times New Roman" w:hAnsi="Times New Roman"/>
+          <w:b w:val="0"/>
+          <w:bCs w:val="0"/>
+          <w:i w:val="0"/>
+          <w:iCs w:val="0"/>
+          <w:sz w:val="22"/>
+          <w:szCs w:val="22"/>
+          <w:rtl w:val="0"/>
+        </w:rPr>
+        <w:t xml:space="preserve">800</w:t>
       </w:r>
       <w:r>
         <w:rPr>
@@ -1453,20 +1453,20 @@
           <w:szCs w:val="22"/>
           <w:rtl w:val="1"/>
         </w:rPr>
-        <w:t xml:space="preserve"> עד </w:t>
-      </w:r>
-      <w:r>
-        <w:rPr>
-          <w:rFonts w:ascii="Times New Roman" w:cs="Times New Roman" w:eastAsia="Times New Roman" w:hAnsi="Times New Roman"/>
-          <w:b w:val="0"/>
-          <w:bCs w:val="0"/>
-          <w:i w:val="0"/>
-          <w:iCs w:val="0"/>
-          <w:sz w:val="22"/>
-          <w:szCs w:val="22"/>
-          <w:rtl w:val="0"/>
-        </w:rPr>
-        <w:t xml:space="preserve">800</w:t>
+        <w:t xml:space="preserve"> הרץ ומשלב אותו עם משקל הכוורת מארבעה תאי עומס ועם טמפרטורה. תמצית קטנה של הנתונים נשלחת בפרוטוקול </w:t>
+      </w:r>
+      <w:r>
+        <w:rPr>
+          <w:rFonts w:ascii="Times New Roman" w:cs="Times New Roman" w:eastAsia="Times New Roman" w:hAnsi="Times New Roman"/>
+          <w:b w:val="0"/>
+          <w:bCs w:val="0"/>
+          <w:i w:val="0"/>
+          <w:iCs w:val="0"/>
+          <w:sz w:val="22"/>
+          <w:szCs w:val="22"/>
+          <w:rtl w:val="0"/>
+        </w:rPr>
+        <w:t xml:space="preserve">ESP-NOW</w:t>
       </w:r>
       <w:r>
         <w:rPr>
@@ -1479,20 +1479,20 @@
           <w:szCs w:val="22"/>
           <w:rtl w:val="1"/>
         </w:rPr>
-        <w:t xml:space="preserve"> הרץ ואת משקל הכוורת, ושולח תמצית קטנה של הנתונים בפרוטוקול </w:t>
-      </w:r>
-      <w:r>
-        <w:rPr>
-          <w:rFonts w:ascii="Times New Roman" w:cs="Times New Roman" w:eastAsia="Times New Roman" w:hAnsi="Times New Roman"/>
-          <w:b w:val="0"/>
-          <w:bCs w:val="0"/>
-          <w:i w:val="0"/>
-          <w:iCs w:val="0"/>
-          <w:sz w:val="22"/>
-          <w:szCs w:val="22"/>
-          <w:rtl w:val="0"/>
-        </w:rPr>
-        <w:t xml:space="preserve">ESP-NOW</w:t>
+        <w:t xml:space="preserve"> למרכזייה מבוססת </w:t>
+      </w:r>
+      <w:r>
+        <w:rPr>
+          <w:rFonts w:ascii="Times New Roman" w:cs="Times New Roman" w:eastAsia="Times New Roman" w:hAnsi="Times New Roman"/>
+          <w:b w:val="0"/>
+          <w:bCs w:val="0"/>
+          <w:i w:val="0"/>
+          <w:iCs w:val="0"/>
+          <w:sz w:val="22"/>
+          <w:szCs w:val="22"/>
+          <w:rtl w:val="0"/>
+        </w:rPr>
+        <w:t xml:space="preserve">ESP32-S3</w:t>
       </w:r>
       <w:r>
         <w:rPr>
@@ -1505,20 +1505,20 @@
           <w:szCs w:val="22"/>
           <w:rtl w:val="1"/>
         </w:rPr>
-        <w:t xml:space="preserve"> למרכזייה מבוססת </w:t>
-      </w:r>
-      <w:r>
-        <w:rPr>
-          <w:rFonts w:ascii="Times New Roman" w:cs="Times New Roman" w:eastAsia="Times New Roman" w:hAnsi="Times New Roman"/>
-          <w:b w:val="0"/>
-          <w:bCs w:val="0"/>
-          <w:i w:val="0"/>
-          <w:iCs w:val="0"/>
-          <w:sz w:val="22"/>
-          <w:szCs w:val="22"/>
-          <w:rtl w:val="0"/>
-        </w:rPr>
-        <w:t xml:space="preserve">ESP32-S3</w:t>
+        <w:t xml:space="preserve"> בכוורן, המוזנת מפאנל סולארי, מזהה בריחת נחיל וחריגות המעידות על מצוקת המושבה, ומעבירה נתונים והתרעות דרך מודם סלולרי לממשק </w:t>
+      </w:r>
+      <w:r>
+        <w:rPr>
+          <w:rFonts w:ascii="Times New Roman" w:cs="Times New Roman" w:eastAsia="Times New Roman" w:hAnsi="Times New Roman"/>
+          <w:b w:val="0"/>
+          <w:bCs w:val="0"/>
+          <w:i w:val="0"/>
+          <w:iCs w:val="0"/>
+          <w:sz w:val="22"/>
+          <w:szCs w:val="22"/>
+          <w:rtl w:val="0"/>
+        </w:rPr>
+        <w:t xml:space="preserve">Web</w:t>
       </w:r>
       <w:r>
         <w:rPr>
@@ -1531,20 +1531,20 @@
           <w:szCs w:val="22"/>
           <w:rtl w:val="1"/>
         </w:rPr>
-        <w:t xml:space="preserve"> בכוורן. המרכזייה מוזנת מפאנל סולארי, מריצה אלגוריתמים לזיהוי בריחת נחיל ולזיהוי חריגות המעידות על מצוקת המושבה, ומעבירה את הנתונים דרך מודם סלולרי לממשק </w:t>
-      </w:r>
-      <w:r>
-        <w:rPr>
-          <w:rFonts w:ascii="Times New Roman" w:cs="Times New Roman" w:eastAsia="Times New Roman" w:hAnsi="Times New Roman"/>
-          <w:b w:val="0"/>
-          <w:bCs w:val="0"/>
-          <w:i w:val="0"/>
-          <w:iCs w:val="0"/>
-          <w:sz w:val="22"/>
-          <w:szCs w:val="22"/>
-          <w:rtl w:val="0"/>
-        </w:rPr>
-        <w:t xml:space="preserve">Web</w:t>
+        <w:t xml:space="preserve">. החדשנות היא מערכת אוטונומית וזולה שמביאה לשטח יכולת שהוכחה במעבדה: השכמה מונעת-אירועים, עיבוד ספקטרלי בתוך הכוורת ושילוב רטט עם משקל, על סוללה ובצריכה נמוכה פי אלפים ממערכות המחקר. נבחן את המערכת בכוורן פעיל לאורך עונת הנחילה באביב, ונמדוד את דיוק השקילה (יעד: </w:t>
+      </w:r>
+      <w:r>
+        <w:rPr>
+          <w:rFonts w:ascii="Times New Roman" w:cs="Times New Roman" w:eastAsia="Times New Roman" w:hAnsi="Times New Roman"/>
+          <w:b w:val="0"/>
+          <w:bCs w:val="0"/>
+          <w:i w:val="0"/>
+          <w:iCs w:val="0"/>
+          <w:sz w:val="22"/>
+          <w:szCs w:val="22"/>
+          <w:rtl w:val="0"/>
+        </w:rPr>
+        <w:t xml:space="preserve">20</w:t>
       </w:r>
       <w:r>
         <w:rPr>
@@ -1557,20 +1557,20 @@
           <w:szCs w:val="22"/>
           <w:rtl w:val="1"/>
         </w:rPr>
-        <w:t xml:space="preserve"> ולהתרעות למגדל. החדשנות היא שילוב של ניתוח רטט ספקטרלי עם מדידת משקל בצומת סוללתי בצריכת הספק נמוכה, לעומת מערכות מחקר הצורכות כמה וואטים מרשת החשמל, ומוצרים מסחריים המודדים משקל בלבד. נבחן את המערכת בכוורן פעיל לאורך עונת הנחילה באביב, ונמדוד את דיוק השקילה (יעד: </w:t>
-      </w:r>
-      <w:r>
-        <w:rPr>
-          <w:rFonts w:ascii="Times New Roman" w:cs="Times New Roman" w:eastAsia="Times New Roman" w:hAnsi="Times New Roman"/>
-          <w:b w:val="0"/>
-          <w:bCs w:val="0"/>
-          <w:i w:val="0"/>
-          <w:iCs w:val="0"/>
-          <w:sz w:val="22"/>
-          <w:szCs w:val="22"/>
-          <w:rtl w:val="0"/>
-        </w:rPr>
-        <w:t xml:space="preserve">20</w:t>
+        <w:t xml:space="preserve">± גרם), אחוז קליטת החבילות (יעד: מעל </w:t>
+      </w:r>
+      <w:r>
+        <w:rPr>
+          <w:rFonts w:ascii="Times New Roman" w:cs="Times New Roman" w:eastAsia="Times New Roman" w:hAnsi="Times New Roman"/>
+          <w:b w:val="0"/>
+          <w:bCs w:val="0"/>
+          <w:i w:val="0"/>
+          <w:iCs w:val="0"/>
+          <w:sz w:val="22"/>
+          <w:szCs w:val="22"/>
+          <w:rtl w:val="0"/>
+        </w:rPr>
+        <w:t xml:space="preserve">95%</w:t>
       </w:r>
       <w:r>
         <w:rPr>
@@ -1583,33 +1583,7 @@
           <w:szCs w:val="22"/>
           <w:rtl w:val="1"/>
         </w:rPr>
-        <w:t xml:space="preserve">± גרם), אחוז קליטת החבילות (יעד: מעל </w:t>
-      </w:r>
-      <w:r>
-        <w:rPr>
-          <w:rFonts w:ascii="Times New Roman" w:cs="Times New Roman" w:eastAsia="Times New Roman" w:hAnsi="Times New Roman"/>
-          <w:b w:val="0"/>
-          <w:bCs w:val="0"/>
-          <w:i w:val="0"/>
-          <w:iCs w:val="0"/>
-          <w:sz w:val="22"/>
-          <w:szCs w:val="22"/>
-          <w:rtl w:val="0"/>
-        </w:rPr>
-        <w:t xml:space="preserve">95%</w:t>
-      </w:r>
-      <w:r>
-        <w:rPr>
-          <w:rFonts w:ascii="Times New Roman" w:cs="Times New Roman" w:eastAsia="Times New Roman" w:hAnsi="Times New Roman"/>
-          <w:b w:val="0"/>
-          <w:bCs w:val="0"/>
-          <w:i w:val="0"/>
-          <w:iCs w:val="0"/>
-          <w:sz w:val="22"/>
-          <w:szCs w:val="22"/>
-          <w:rtl w:val="1"/>
-        </w:rPr>
-        <w:t xml:space="preserve">), צריכת הזרם הממוצעת של הצומת (יעד: מתחת למיליאמפר אחד, כלומר לפחות חצי שנה על סוללה), ודיוק (</w:t>
+        <w:t xml:space="preserve">), זמן פעולה על סוללה (יעד: לפחות חצי שנה), ודיוק (</w:t>
       </w:r>
       <w:r>
         <w:rPr>
@@ -1724,7 +1698,7 @@
           <w:szCs w:val="22"/>
           <w:rtl w:val="1"/>
         </w:rPr>
-        <w:t xml:space="preserve"> האינטרנט של הדברים, ניטור כוורות, דבורת הדבש, חיישן פיאזואלקטרי, עיבוד אותות, צפיפות הספק ספקטרלית, תאי עומס, מערכות משובצות בהספק נמוך, </w:t>
+        <w:t xml:space="preserve"> האינטרנט של הדברים, ניטור כוורות, דבורת הדבש, חיישן פיאזואלקטרי, השכמה מונעת-אירועים, עיבוד אותות, צפיפות הספק ספקטרלית, תאי עומס, מערכות משובצות בהספק נמוך, </w:t>
       </w:r>
       <w:r>
         <w:rPr>
@@ -1750,7 +1724,7 @@
           <w:szCs w:val="22"/>
           <w:rtl w:val="1"/>
         </w:rPr>
-        <w:t xml:space="preserve">, זיהוי חריגות.</w:t>
+        <w:t xml:space="preserve">.</w:t>
       </w:r>
     </w:p>
     <w:p>
@@ -2017,7 +1991,7 @@
           <w:szCs w:val="22"/>
           <w:rtl w:val="0"/>
         </w:rPr>
-        <w:t xml:space="preserve">Honeybees are essential crop pollinators, yet colonies are still checked mainly by opening the hive every week or two, and between visits the beekeeper does not know what happens inside. A swarm, for example, takes a large part of the colony away, and is often discovered only at the next visit. BeeSense is an Internet of Things (IoT) system for continuous monitoring of hives at apiaries without mains power or network. Each hive carries a battery-powered ESP32-C3 node with a piezoelectric vibration sensor attached to the brood frame, a MEMS microphone for comparison, four load cells under the hive, and temperature sensors. The node computes the buzzing spectrum between 50 and 800 Hz and the hive weight on board, and sends a compact summary over ESP-NOW to an ESP32-S3 hub at the apiary. The solar-powered hub runs algorithms that detect swarm departures and anomalies that indicate colony distress, and forwards the data over a cellular modem to a web dashboard and alerts. The innovation is the fusion of spectral vibration analysis and weight in a low-power battery node, compared with research systems that draw several watts from mains power and commercial products that measure weight only. We will evaluate the system at a working apiary through the spring swarming season and measure weighing accuracy (target: ±20 g), packet delivery ratio (target: above 95%), average node current (target: below 1 mA, i.e. at least six months per charge), and event-level precision and recall for swarms and controlled events (target: above 90%). Early swarm prediction and diagnosis of specific diseases are exploratory directions, not committed outcomes of this project.</w:t>
+        <w:t xml:space="preserve">Honeybees are essential crop pollinators, yet colonies are still checked mainly by opening the hive every week or two, and between visits the beekeeper does not know what happens inside. Swarm preparation takes one to two weeks, and the swarm itself, which takes a large part of the colony away, leaves within minutes and is often discovered only at the next visit. BeeSense is an Internet of Things (IoT) system for continuous monitoring of hives at apiaries without mains power or network. Each hive carries a battery-powered ESP32-C3 node. A piezoelectric vibration sensor embedded in the central comb listens continuously at nanoampere current and wakes the node when vibration rises above the background; on every wake-up, and periodically every 15 minutes, the node records the piezo and a MEMS microphone, computes their spectra between 50 and 800 Hz, and fuses them with hive weight from four load cells and with temperature. A compact summary is sent over ESP-NOW to a solar-powered ESP32-S3 hub at the apiary, which detects swarm departures and anomalies that indicate colony distress, and forwards data and alerts over a cellular modem to a web dashboard. The innovation is an autonomous, low-cost system that brings a laboratory-proven capability to the field: event-driven wake-up, on-board spectral processing and fusion of vibration with weight, on battery, at thousands of times less power than research systems. We will evaluate the system at a working apiary through the spring swarming season and measure weighing accuracy (target: ±20 g), packet delivery ratio (target: above 95%), battery life (target: at least six months), and event-level precision and recall for swarms and controlled events (target: above 90%). Early swarm prediction and diagnosis of specific diseases are exploratory directions, not committed outcomes of this project.</w:t>
       </w:r>
     </w:p>
     <w:p>
@@ -2058,7 +2032,7 @@
           <w:szCs w:val="22"/>
           <w:rtl w:val="0"/>
         </w:rPr>
-        <w:t xml:space="preserve"> Internet of Things, Hive Monitoring, Honeybees, Vibration Sensing, Signal Processing, Power Spectral Density, Load Cells, Low-Power Embedded Systems, ESP32, ESP-NOW, Anomaly Detection.</w:t>
+        <w:t xml:space="preserve"> Internet of Things, Hive Monitoring, Honeybees, Piezoelectric Sensor, Event-Driven Wake-Up, Signal Processing, Power Spectral Density, Load Cells, Low-Power Embedded Systems, ESP32, ESP-NOW.</w:t>
       </w:r>
     </w:p>
     <w:p>
@@ -2110,7 +2084,7 @@
           <w:szCs w:val="22"/>
           <w:rtl w:val="0"/>
         </w:rPr>
-        <w:t xml:space="preserve">BeeSense – low-power vibration and weight monitoring of honeybee hives</w:t>
+        <w:t xml:space="preserve">BeeSense – event-driven vibration and weight monitoring of honeybee hives</w:t>
       </w:r>
     </w:p>
     <w:p>
@@ -2157,7 +2131,7 @@
           <w:szCs w:val="22"/>
           <w:rtl w:val="0"/>
         </w:rPr>
-        <w:t xml:space="preserve">Honeybee colonies are inspected mostly by opening the hive every one to two weeks; inspections disturb the colony, cost labour, and leave the beekeeper blind between visits. Precision beekeeping, i.e. monitoring colonies with sensors so that interventions are based on data, was proposed to close this gap [1]. Hive vibrations change measurably before swarming [2], [3], and continuous hive weight reveals foraging, consumption and swarm departures [4]. Initial use case: a beekeeper with many Langstroth hives standing close together at a remote apiary without mains power or Wi-Fi, visiting weekly. The system must alert when a swarm leaves or a colony behaves abnormally, and show which hives need a visit first. Applications: commercial and hobby apiaries, pollination services, and research apiaries that need long continuous records.</w:t>
+        <w:t xml:space="preserve">Honeybee colonies are inspected mostly by opening the hive every one to two weeks; inspections disturb the colony, cost labour, and leave the beekeeper blind between visits. Precision beekeeping, i.e. monitoring colonies with sensors so that interventions are based on data, was proposed to close this gap [1]. Swarming is the costliest blind spot: the colony rears new queens for one to two weeks, the prime swarm leaves with the old queen once the queen cells are capped, clusters nearby for a few hours, and is then lost. Hive vibrations change measurably before swarming [2], [3], and continuous hive weight reveals foraging, consumption and swarm departures [4]. Initial use case: a beekeeper with many hives standing close together at a remote apiary without mains power or Wi-Fi, visiting weekly. The system must alert when a swarm leaves or a colony behaves abnormally, and show which hives need a visit first. Applications: commercial and hobby apiaries, pollination services, and research apiaries that need long continuous records.</w:t>
       </w:r>
     </w:p>
     <w:p>
@@ -2244,7 +2218,7 @@
           <w:szCs w:val="22"/>
           <w:rtl w:val="0"/>
         </w:rPr>
-        <w:t xml:space="preserve">(1) a battery-powered hive node that measures the vibration spectrum, weight and temperature and runs at least six months per charge (targets in Section 3.3);</w:t>
+        <w:t xml:space="preserve">(1) a battery-powered hive node with event-driven wake-up that measures vibration and sound spectra, weight and temperature, and runs at least six months per charge (targets in Section 3.3);</w:t>
       </w:r>
     </w:p>
     <w:p>
@@ -2349,7 +2323,7 @@
           <w:szCs w:val="22"/>
           <w:rtl w:val="0"/>
         </w:rPr>
-        <w:t xml:space="preserve">(1) define requirements with the cooperating beekeeper; bench-test the piezo chain (known tones), the weighing chain (reference masses) and the FFT time on the ESP32-C3.</w:t>
+        <w:t xml:space="preserve">(1) define requirements with the cooperating beekeeper; bench-test the piezo and wake chains, the weighing chain and the FFT time on the ESP32-C3; record one hive at night to compare signal and noise floor.</w:t>
       </w:r>
     </w:p>
     <w:p>
@@ -2372,7 +2346,7 @@
           <w:szCs w:val="22"/>
           <w:rtl w:val="0"/>
         </w:rPr>
-        <w:t xml:space="preserve">(2) build the node: acquisition, on-board spectrum, power modes; compare piezo and microphone; measure ESP-NOW range at the apiary.</w:t>
+        <w:t xml:space="preserve">(2) build the node: wake circuit, acquisition, on-board spectra, power modes; compare piezo and microphone; measure ESP-NOW range at the apiary.</w:t>
       </w:r>
     </w:p>
     <w:p>
@@ -2465,7 +2439,7 @@
           <w:szCs w:val="22"/>
           <w:rtl w:val="0"/>
         </w:rPr>
-        <w:t xml:space="preserve">Each hive node uses an ESP32-C3 SuperMini (RISC-V, 160 MHz, Wi-Fi radio, no floating-point unit). The main vibration sensor is a 27 mm piezo disc glued to the brood frame: like the accelerometers in [3] it senses comb vibration, with less wind and outside noise than a microphone. An op-amp preamplifier buffers and biases the disc, protects the ADC and is the anti-aliasing low-pass (≈800 Hz). An I²S MEMS microphone is a comparison channel. Weight: four 50 kg half-bridge load cells under a hive platform and an HX711 24-bit ADC; temperature: DS18B20 probes. Power: one 18650 cell and a low-quiescent LDO. Nodes report over ESP-NOW, a connectionless protocol on the Wi-Fi radio, to an ESP32-S3 hub serving a group of nearby hives; the hub uploads over a cellular modem and runs from an 18 V / 15 W solar panel, an MPPT charger and a Li-ion pack. As the hives stand close together, one SIM per hub replaces a LoRa radio or a SIM in every hive. Our contribution is a battery-powered node that reduces raw vibration to spectral features inside the hive and fuses them with weight to detect colony events, with measured accuracy, link reliability and energy.</w:t>
+        <w:t xml:space="preserve">Each hive node uses an ESP32-C3 SuperMini (RISC-V, 160 MHz, Wi-Fi radio, no floating-point unit). A 27 mm piezo disc is pressed into the comb at the centre of the central frame and covered with wax, where comb vibration is strongest (Section 3.2). It has two roles. First, a nanopower wake circuit (envelope detector and comparator, about 2 µA) compares the vibration envelope with its own slow average and wakes the MCU through a GPIO when the envelope jumps. Second, an op-amp preamplifier, powered only while recording, biases and protects the signal for the ADC and acts as the anti-aliasing low-pass (≈800 Hz). An I²S MEMS microphone, inside the hive behind a mesh, is the second analysis channel. Weight: four 50 kg half-bridge load cells under a hive platform and an HX711 24-bit ADC; temperature: DS18B20 probes. Power: one 18650 cell and a low-quiescent LDO. Nodes report over ESP-NOW, a connectionless protocol on the Wi-Fi radio, to an ESP32-S3 hub serving a group of nearby hives; the hub uploads over a cellular modem and runs from an 18 V / 15 W solar panel, an MPPT charger and a Li-ion pack. As the hives stand close together, one SIM per hub replaces a LoRa radio or a SIM in every hive.</w:t>
       </w:r>
       <w:r>
         <w:rPr>
@@ -2487,7 +2461,7 @@
         </w:rPr>
         <w:drawing>
           <wp:inline distB="0" distT="0" distL="114300" distR="114300">
-            <wp:extent cx="5577840" cy="1975485"/>
+            <wp:extent cx="5577840" cy="2130425"/>
             <wp:effectExtent b="0" l="0" r="0" t="0"/>
             <wp:docPr id="6" name="image1.png"/>
             <a:graphic>
@@ -2507,7 +2481,7 @@
                   <pic:spPr>
                     <a:xfrm>
                       <a:off x="0" y="0"/>
-                      <a:ext cx="5577840" cy="1975485"/>
+                      <a:ext cx="5577840" cy="2130425"/>
                     </a:xfrm>
                     <a:prstGeom prst="rect"/>
                     <a:ln/>
@@ -2539,7 +2513,7 @@
           <w:szCs w:val="18"/>
           <w:rtl w:val="0"/>
         </w:rPr>
-        <w:t xml:space="preserve">Fig. 1.  BeeSense block diagram (blue: BeeSense system, grey: external).</w:t>
+        <w:t xml:space="preserve">Fig. 1.  BeeSense block diagram (blue: BeeSense system, grey: external; red: event wake-up path).</w:t>
       </w:r>
     </w:p>
     <w:p>
@@ -2591,7 +2565,7 @@
           <w:szCs w:val="22"/>
           <w:rtl w:val="0"/>
         </w:rPr>
-        <w:t xml:space="preserve">Ferrari et al. recorded hive sounds with in-hive microphones and found that the power spectral density near 110 Hz rises, and shifts upward in frequency, before swarming [2]. Ramsey et al. placed accelerometers in the heart of the colony and, by tracking how the vibrational spectra evolve, separated colonies preparing to swarm with more than 90% accuracy, up to 30 days ahead [3]. Cecchi et al. built a multi-sensor hive with microphones, weighing to ±10 g and CO₂, but each hive used a Raspberry Pi drawing about 4 W from mains power [5]. Commercially, BroodMinder hive scales log weight only [6], and BeeHero in-hive sensors measure acoustics and climate and report over Bluetooth Low Energy to a cellular gateway in a closed system [7] (Table I). Like BeeHero, we use a short-range link inside the apiary and one cellular uplink, but with open, measured processing and weight fusion.</w:t>
+        <w:t xml:space="preserve">Ferrari et al. recorded hive sounds with in-hive microphones and found that the power spectral density near 110 Hz rises, and shifts upward in frequency, before swarming [2]. Ramsey et al. placed accelerometers in the heart of the colony and, by tracking how the vibrational spectra evolve, separated colonies preparing to swarm with more than 90% accuracy, up to 30 days ahead [3]; Bencsik et al. predicted swarming several days ahead with a simple transducer on the outside hive wall [5]. Cecchi et al. built a multi-sensor hive with microphones, weighing to ±10 g and CO₂, but each hive used a Raspberry Pi drawing about 4 W from mains power [6]. Commercially, BroodMinder hive scales log weight only [7], and BeeHero in-hive sensors measure acoustics and climate and report over Bluetooth Low Energy to a cellular gateway in a closed system [8] (Table I). The research systems used laboratory-grade sensors, mains power and offline analysis; our contribution is engineering: event-driven, on-board processing that fuses vibration with weight on a node drawing ≈1 mW on average, with measured accuracy, link reliability and energy.</w:t>
       </w:r>
     </w:p>
     <w:p>
@@ -2752,7 +2726,7 @@
                 <w:szCs w:val="18"/>
                 <w:rtl w:val="0"/>
               </w:rPr>
-              <w:t xml:space="preserve">Ferrari [2], Ramsey [3]</w:t>
+              <w:t xml:space="preserve">Ferrari [2], Ramsey [3], Bencsik [5]</w:t>
             </w:r>
           </w:p>
         </w:tc>
@@ -2776,7 +2750,7 @@
                 <w:szCs w:val="18"/>
                 <w:rtl w:val="0"/>
               </w:rPr>
-              <w:t xml:space="preserve">In-hive sound/vibration features precede swarming</w:t>
+              <w:t xml:space="preserve">Sound/vibration features precede swarming</w:t>
             </w:r>
           </w:p>
         </w:tc>
@@ -2800,7 +2774,7 @@
                 <w:szCs w:val="18"/>
                 <w:rtl w:val="0"/>
               </w:rPr>
-              <w:t xml:space="preserve">Same features on a low-power node, in the field</w:t>
+              <w:t xml:space="preserve">Same features on a battery node, in the field</w:t>
             </w:r>
           </w:p>
         </w:tc>
@@ -2830,7 +2804,7 @@
                 <w:szCs w:val="18"/>
                 <w:rtl w:val="0"/>
               </w:rPr>
-              <w:t xml:space="preserve">Cecchi et al. [5]</w:t>
+              <w:t xml:space="preserve">Cecchi et al. [6]</w:t>
             </w:r>
           </w:p>
         </w:tc>
@@ -2873,7 +2847,7 @@
                 <w:szCs w:val="18"/>
                 <w:rtl w:val="0"/>
               </w:rPr>
-              <w:t xml:space="preserve">Battery operation, ~mW average power</w:t>
+              <w:t xml:space="preserve">Battery operation, ~1 mW average power</w:t>
             </w:r>
           </w:p>
         </w:tc>
@@ -2903,7 +2877,7 @@
                 <w:szCs w:val="18"/>
                 <w:rtl w:val="0"/>
               </w:rPr>
-              <w:t xml:space="preserve">BroodMinder [6]</w:t>
+              <w:t xml:space="preserve">BroodMinder [7]</w:t>
             </w:r>
           </w:p>
         </w:tc>
@@ -2980,7 +2954,7 @@
                 <w:szCs w:val="18"/>
                 <w:rtl w:val="0"/>
               </w:rPr>
-              <w:t xml:space="preserve">BeeHero [7]</w:t>
+              <w:t xml:space="preserve">BeeHero [8]</w:t>
             </w:r>
           </w:p>
         </w:tc>
@@ -3082,7 +3056,7 @@
           <w:szCs w:val="22"/>
           <w:rtl w:val="0"/>
         </w:rPr>
-        <w:t xml:space="preserve">3.1 Signal Processing and Event Detection</w:t>
+        <w:t xml:space="preserve">3.1 Event-Driven Acquisition, Signal Processing and Detection</w:t>
       </w:r>
     </w:p>
     <w:p>
@@ -3105,7 +3079,7 @@
           <w:szCs w:val="22"/>
           <w:rtl w:val="0"/>
         </w:rPr>
-        <w:t xml:space="preserve">Every interval </w:t>
+        <w:t xml:space="preserve">The node wakes periodically every </w:t>
       </w:r>
       <w:r>
         <w:rPr>
@@ -3145,7 +3119,7 @@
           <w:szCs w:val="22"/>
           <w:rtl w:val="0"/>
         </w:rPr>
-        <w:t xml:space="preserve"> (default 10 min) the node wakes, records </w:t>
+        <w:t xml:space="preserve"> = 15 min and on events from the wake circuit; after an event wake it ignores further triggers for 20 min, so a long disturbance costs one acquisition. On every wake it records </w:t>
       </w:r>
       <w:r>
         <w:rPr>
@@ -3225,7 +3199,7 @@
           <w:szCs w:val="22"/>
           <w:rtl w:val="0"/>
         </w:rPr>
-        <w:t xml:space="preserve"> = 2 kHz (ADC with DMA) and averages the weight over 1 s. The power spectral density </w:t>
+        <w:t xml:space="preserve"> = 2 kHz (ADC with DMA) and of microphone signal (decimated to 2 kHz), and averages the weight over 1 s. For each channel the power spectral density </w:t>
       </w:r>
       <w:r>
         <w:rPr>
@@ -3303,7 +3277,7 @@
           <w:szCs w:val="22"/>
           <w:rtl w:val="0"/>
         </w:rPr>
-        <w:t xml:space="preserve"> = </w:t>
+        <w:t xml:space="preserve"> ≈ 1.95 Hz) using a fixed-point FFT, since the C3 has no floating-point unit, and reduced to </w:t>
       </w:r>
       <w:r>
         <w:rPr>
@@ -3316,7 +3290,20 @@
           <w:szCs w:val="22"/>
           <w:rtl w:val="0"/>
         </w:rPr>
-        <w:t xml:space="preserve">f</w:t>
+        <w:t xml:space="preserve">K</w:t>
+      </w:r>
+      <w:r>
+        <w:rPr>
+          <w:rFonts w:ascii="Times New Roman" w:cs="Times New Roman" w:eastAsia="Times New Roman" w:hAnsi="Times New Roman"/>
+          <w:b w:val="0"/>
+          <w:bCs w:val="0"/>
+          <w:i w:val="0"/>
+          <w:iCs w:val="0"/>
+          <w:sz w:val="22"/>
+          <w:szCs w:val="22"/>
+          <w:rtl w:val="0"/>
+        </w:rPr>
+        <w:t xml:space="preserve"> = 24 logarithmically spaced bands </w:t>
       </w:r>
       <w:r>
         <w:rPr>
@@ -3327,23 +3314,9 @@
           <w:iCs w:val="1"/>
           <w:sz w:val="22"/>
           <w:szCs w:val="22"/>
-          <w:vertAlign w:val="subscript"/>
-          <w:rtl w:val="0"/>
-        </w:rPr>
-        <w:t xml:space="preserve">s</w:t>
-      </w:r>
-      <w:r>
-        <w:rPr>
-          <w:rFonts w:ascii="Times New Roman" w:cs="Times New Roman" w:eastAsia="Times New Roman" w:hAnsi="Times New Roman"/>
-          <w:b w:val="0"/>
-          <w:bCs w:val="0"/>
-          <w:i w:val="0"/>
-          <w:iCs w:val="0"/>
-          <w:sz w:val="22"/>
-          <w:szCs w:val="22"/>
-          <w:rtl w:val="0"/>
-        </w:rPr>
-        <w:t xml:space="preserve">/1024 ≈ 1.95 Hz) using a fixed-point FFT, since the ESP32-C3 has no floating-point unit, and reduced to </w:t>
+          <w:rtl w:val="0"/>
+        </w:rPr>
+        <w:t xml:space="preserve">B</w:t>
       </w:r>
       <w:r>
         <w:rPr>
@@ -3354,22 +3327,23 @@
           <w:iCs w:val="1"/>
           <w:sz w:val="22"/>
           <w:szCs w:val="22"/>
-          <w:rtl w:val="0"/>
-        </w:rPr>
-        <w:t xml:space="preserve">K</w:t>
-      </w:r>
-      <w:r>
-        <w:rPr>
-          <w:rFonts w:ascii="Times New Roman" w:cs="Times New Roman" w:eastAsia="Times New Roman" w:hAnsi="Times New Roman"/>
-          <w:b w:val="0"/>
-          <w:bCs w:val="0"/>
-          <w:i w:val="0"/>
-          <w:iCs w:val="0"/>
-          <w:sz w:val="22"/>
-          <w:szCs w:val="22"/>
-          <w:rtl w:val="0"/>
-        </w:rPr>
-        <w:t xml:space="preserve"> = 24 logarithmically spaced bands </w:t>
+          <w:vertAlign w:val="subscript"/>
+          <w:rtl w:val="0"/>
+        </w:rPr>
+        <w:t xml:space="preserve">k</w:t>
+      </w:r>
+      <w:r>
+        <w:rPr>
+          <w:rFonts w:ascii="Times New Roman" w:cs="Times New Roman" w:eastAsia="Times New Roman" w:hAnsi="Times New Roman"/>
+          <w:b w:val="0"/>
+          <w:bCs w:val="0"/>
+          <w:i w:val="0"/>
+          <w:iCs w:val="0"/>
+          <w:sz w:val="22"/>
+          <w:szCs w:val="22"/>
+          <w:rtl w:val="0"/>
+        </w:rPr>
+        <w:t xml:space="preserve"> inside </w:t>
       </w:r>
       <w:r>
         <w:rPr>
@@ -3389,53 +3363,13 @@
           <w:rFonts w:ascii="Times New Roman" w:cs="Times New Roman" w:eastAsia="Times New Roman" w:hAnsi="Times New Roman"/>
           <w:b w:val="0"/>
           <w:bCs w:val="0"/>
-          <w:i w:val="1"/>
-          <w:iCs w:val="1"/>
-          <w:sz w:val="22"/>
-          <w:szCs w:val="22"/>
-          <w:vertAlign w:val="subscript"/>
-          <w:rtl w:val="0"/>
-        </w:rPr>
-        <w:t xml:space="preserve">k</w:t>
-      </w:r>
-      <w:r>
-        <w:rPr>
-          <w:rFonts w:ascii="Times New Roman" w:cs="Times New Roman" w:eastAsia="Times New Roman" w:hAnsi="Times New Roman"/>
-          <w:b w:val="0"/>
-          <w:bCs w:val="0"/>
-          <w:i w:val="0"/>
-          <w:iCs w:val="0"/>
-          <w:sz w:val="22"/>
-          <w:szCs w:val="22"/>
-          <w:rtl w:val="0"/>
-        </w:rPr>
-        <w:t xml:space="preserve"> inside the band </w:t>
-      </w:r>
-      <w:r>
-        <w:rPr>
-          <w:rFonts w:ascii="Times New Roman" w:cs="Times New Roman" w:eastAsia="Times New Roman" w:hAnsi="Times New Roman"/>
-          <w:b w:val="0"/>
-          <w:bCs w:val="0"/>
-          <w:i w:val="1"/>
-          <w:iCs w:val="1"/>
-          <w:sz w:val="22"/>
-          <w:szCs w:val="22"/>
-          <w:rtl w:val="0"/>
-        </w:rPr>
-        <w:t xml:space="preserve">B</w:t>
-      </w:r>
-      <w:r>
-        <w:rPr>
-          <w:rFonts w:ascii="Times New Roman" w:cs="Times New Roman" w:eastAsia="Times New Roman" w:hAnsi="Times New Roman"/>
-          <w:b w:val="0"/>
-          <w:bCs w:val="0"/>
-          <w:i w:val="0"/>
-          <w:iCs w:val="0"/>
-          <w:sz w:val="22"/>
-          <w:szCs w:val="22"/>
-          <w:rtl w:val="0"/>
-        </w:rPr>
-        <w:t xml:space="preserve"> = 50–800 Hz, which covers the swarming band reported in [2]. Relative band energies cancel the sensor coupling and gain:</w:t>
+          <w:i w:val="0"/>
+          <w:iCs w:val="0"/>
+          <w:sz w:val="22"/>
+          <w:szCs w:val="22"/>
+          <w:rtl w:val="0"/>
+        </w:rPr>
+        <w:t xml:space="preserve"> = 50–800 Hz, which covers the swarming band [2] and queen piping (≈200–500 Hz). Relative band energies cancel sensor coupling and gain:</w:t>
       </w:r>
     </w:p>
     <w:p>
@@ -4115,7 +4049,7 @@
           <w:szCs w:val="22"/>
           <w:rtl w:val="0"/>
         </w:rPr>
-        <w:t xml:space="preserve">Each ≈50-byte payload (24 band energies, total vibration power, weight, temperatures, battery voltage) is sent over ESP-NOW. Since colony activity follows a daily cycle [4], the hub compares each feature </w:t>
+        <w:t xml:space="preserve">Each ≈75-byte payload (band energies of both channels, total powers, weight, temperatures, battery voltage, wake cause) is sent over ESP-NOW. Since colony activity follows a daily cycle [4], the hub compares each feature </w:t>
       </w:r>
       <w:r>
         <w:rPr>
@@ -4339,7 +4273,7 @@
           <w:szCs w:val="22"/>
           <w:rtl w:val="0"/>
         </w:rPr>
-        <w:t xml:space="preserve"> = 30 min in daytime, together with a vibration-power anomaly. A prime swarm carries roughly 10,000–20,000 bees, about 1–2 kg at ≈0.1 g per bee, so </w:t>
+        <w:t xml:space="preserve"> = 30 min in daytime, together with an event wake or vibration-power anomaly. A prime swarm carries roughly 10,000–20,000 bees, about 1–2 kg at ≈0.1 g per bee, so </w:t>
       </w:r>
       <w:r>
         <w:rPr>
@@ -4379,7 +4313,7 @@
           <w:szCs w:val="22"/>
           <w:rtl w:val="0"/>
         </w:rPr>
-        <w:t xml:space="preserve"> = 0.8 kg is an initial value, tuned on data. Logged inspections are excluded, and an empty-hive control platform separates rain and drift [4]. On an anomaly the node also sends the full spectrum. Swarm-preparation indicators, following the spectral-trend approach of [3], are studied offline against inspection records.</w:t>
+        <w:t xml:space="preserve"> = 0.8 kg is an initial value, tuned on data. Logged inspections are excluded, and an empty-hive control platform separates rain and drift [4]. Swarm-preparation indicators, following the spectral-trend approach of [3], are studied offline against inspection records.</w:t>
       </w:r>
     </w:p>
     <w:p>
@@ -4403,7 +4337,7 @@
           <w:szCs w:val="22"/>
           <w:rtl w:val="0"/>
         </w:rPr>
-        <w:t xml:space="preserve">3.2 Feasibility – Data, Link, Weighing and Power Budgets</w:t>
+        <w:t xml:space="preserve">3.2 Feasibility – Signal Levels, Data, Link and Power Budgets</w:t>
       </w:r>
     </w:p>
     <w:p>
@@ -4426,7 +4360,7 @@
           <w:szCs w:val="22"/>
           <w:rtl w:val="0"/>
         </w:rPr>
-        <w:t xml:space="preserve">The parts are in hand but no node is built yet, so feasibility is shown from datasheet values, each to be replaced by a bench measurement. </w:t>
+        <w:t xml:space="preserve">The parts are in hand but no node is built yet, so feasibility is shown from published measurements and datasheet values, each to be replaced by a bench measurement. </w:t>
       </w:r>
       <w:r>
         <w:rPr>
@@ -4439,20 +4373,20 @@
           <w:szCs w:val="22"/>
           <w:rtl w:val="0"/>
         </w:rPr>
-        <w:t xml:space="preserve">Data:</w:t>
-      </w:r>
-      <w:r>
-        <w:rPr>
-          <w:rFonts w:ascii="Times New Roman" w:cs="Times New Roman" w:eastAsia="Times New Roman" w:hAnsi="Times New Roman"/>
-          <w:b w:val="0"/>
-          <w:bCs w:val="0"/>
-          <w:i w:val="0"/>
-          <w:iCs w:val="0"/>
-          <w:sz w:val="22"/>
-          <w:szCs w:val="22"/>
-          <w:rtl w:val="0"/>
-        </w:rPr>
-        <w:t xml:space="preserve"> raw piezo data is 2000 samples/s × 2 bytes = 4 kB/s (≈350 MB per hive per day); on-board features reduce it to ≈50 bytes per 10 min (≈7 kB/day), one ESP-NOW frame (≤250 bytes [8]); 20 hives need only ≈4 MB/month of cellular data. </w:t>
+        <w:t xml:space="preserve">Signal levels:</w:t>
+      </w:r>
+      <w:r>
+        <w:rPr>
+          <w:rFonts w:ascii="Times New Roman" w:cs="Times New Roman" w:eastAsia="Times New Roman" w:hAnsi="Times New Roman"/>
+          <w:b w:val="0"/>
+          <w:bCs w:val="0"/>
+          <w:i w:val="0"/>
+          <w:iCs w:val="0"/>
+          <w:sz w:val="22"/>
+          <w:szCs w:val="22"/>
+          <w:rtl w:val="0"/>
+        </w:rPr>
+        <w:t xml:space="preserve"> comb vibration measured at night with laboratory accelerometers is only 1–5 µm/s² per spectral bin, and about ten times weaker on the hive wall [9]; a MEMS accelerometer (≈25 µg/√Hz, i.e. ≈4×10⁻⁴ m/s² per 3 Hz bin) would sit about a hundred times above it, which is why we use a piezoelectric sensor in the comb. A swarm departure is a large event (mass flight, 1–2 kg weight drop) and is the committed target; whether our piezo chain also resolves the quiet pre-swarm changes is measured in Stage 1, with the microphone, as used in [2], and an external audio ADC as fallbacks. </w:t>
       </w:r>
       <w:r>
         <w:rPr>
@@ -4465,20 +4399,20 @@
           <w:szCs w:val="22"/>
           <w:rtl w:val="0"/>
         </w:rPr>
-        <w:t xml:space="preserve">Link:</w:t>
-      </w:r>
-      <w:r>
-        <w:rPr>
-          <w:rFonts w:ascii="Times New Roman" w:cs="Times New Roman" w:eastAsia="Times New Roman" w:hAnsi="Times New Roman"/>
-          <w:b w:val="0"/>
-          <w:bCs w:val="0"/>
-          <w:i w:val="0"/>
-          <w:iCs w:val="0"/>
-          <w:sz w:val="22"/>
-          <w:szCs w:val="22"/>
-          <w:rtl w:val="0"/>
-        </w:rPr>
-        <w:t xml:space="preserve"> ESP-NOW runs at 1 Mbps with a MAC-level acknowledgement [8]; we add sequence numbers and retries. Wood, honey and bees attenuate 2.4 GHz, so the radio sits outside the hive body; range with the small SuperMini antenna is the main link risk, measured on site first (fallback: LoRa on SPI). </w:t>
+        <w:t xml:space="preserve">Data and link:</w:t>
+      </w:r>
+      <w:r>
+        <w:rPr>
+          <w:rFonts w:ascii="Times New Roman" w:cs="Times New Roman" w:eastAsia="Times New Roman" w:hAnsi="Times New Roman"/>
+          <w:b w:val="0"/>
+          <w:bCs w:val="0"/>
+          <w:i w:val="0"/>
+          <w:iCs w:val="0"/>
+          <w:sz w:val="22"/>
+          <w:szCs w:val="22"/>
+          <w:rtl w:val="0"/>
+        </w:rPr>
+        <w:t xml:space="preserve"> raw data is 4 kB/s per channel; features reduce it to ≈75 bytes per report, one ESP-NOW frame (≤250 bytes, 1 Mbps, MAC-level acknowledgement [10]), so 20 hives need ≈5 MB/month of cellular data. Wood, honey and bees attenuate 2.4 GHz, so the radio sits outside the hive body; range is measured on site first (fallback: LoRa on SPI). </w:t>
       </w:r>
       <w:r>
         <w:rPr>
@@ -4504,7 +4438,7 @@
           <w:szCs w:val="22"/>
           <w:rtl w:val="0"/>
         </w:rPr>
-        <w:t xml:space="preserve"> four 50 kg cells at 1 mV/V and 3.3 V excitation give ≈3.3 mV at the 200 kg full scale, i.e. 16.5 µV/kg; the HX711 input noise of 50 nV rms at 10 samples/s [9] equals ≈3 g, well below the 20 g target, so load-cell temperature drift, not ADC noise, will set field accuracy. </w:t>
+        <w:t xml:space="preserve"> four 50 kg cells at 1 mV/V and 3.3 V excitation give 16.5 µV/kg; the HX711 noise of 50 nV rms at 10 samples/s [11] equals ≈3 g, so load-cell temperature drift will set field accuracy. </w:t>
       </w:r>
       <w:r>
         <w:rPr>
@@ -4610,7 +4544,7 @@
           <w:szCs w:val="22"/>
           <w:rtl w:val="0"/>
         </w:rPr>
-        <w:t xml:space="preserve"> in a cycle of length </w:t>
+        <w:t xml:space="preserve"> per acquisition, </w:t>
       </w:r>
       <w:r>
         <w:rPr>
@@ -4623,7 +4557,20 @@
           <w:szCs w:val="22"/>
           <w:rtl w:val="0"/>
         </w:rPr>
-        <w:t xml:space="preserve">T</w:t>
+        <w:t xml:space="preserve">A</w:t>
+      </w:r>
+      <w:r>
+        <w:rPr>
+          <w:rFonts w:ascii="Times New Roman" w:cs="Times New Roman" w:eastAsia="Times New Roman" w:hAnsi="Times New Roman"/>
+          <w:b w:val="0"/>
+          <w:bCs w:val="0"/>
+          <w:i w:val="0"/>
+          <w:iCs w:val="0"/>
+          <w:sz w:val="22"/>
+          <w:szCs w:val="22"/>
+          <w:rtl w:val="0"/>
+        </w:rPr>
+        <w:t xml:space="preserve"> acquisitions per day and a continuous current </w:t>
       </w:r>
       <w:r>
         <w:rPr>
@@ -4634,10 +4581,23 @@
           <w:iCs w:val="1"/>
           <w:sz w:val="22"/>
           <w:szCs w:val="22"/>
+          <w:rtl w:val="0"/>
+        </w:rPr>
+        <w:t xml:space="preserve">I</w:t>
+      </w:r>
+      <w:r>
+        <w:rPr>
+          <w:rFonts w:ascii="Times New Roman" w:cs="Times New Roman" w:eastAsia="Times New Roman" w:hAnsi="Times New Roman"/>
+          <w:b w:val="0"/>
+          <w:bCs w:val="0"/>
+          <w:i w:val="1"/>
+          <w:iCs w:val="1"/>
+          <w:sz w:val="22"/>
+          <w:szCs w:val="22"/>
           <w:vertAlign w:val="subscript"/>
           <w:rtl w:val="0"/>
         </w:rPr>
-        <w:t xml:space="preserve">c</w:t>
+        <w:t xml:space="preserve">0</w:t>
       </w:r>
       <w:r>
         <w:rPr>
@@ -4703,7 +4663,7 @@
           <w:szCs w:val="22"/>
           <w:rtl w:val="0"/>
         </w:rPr>
-        <w:t xml:space="preserve"> = Σ</w:t>
+        <w:t xml:space="preserve"> = </w:t>
       </w:r>
       <w:r>
         <w:rPr>
@@ -4714,23 +4674,9 @@
           <w:iCs w:val="1"/>
           <w:sz w:val="22"/>
           <w:szCs w:val="22"/>
-          <w:vertAlign w:val="subscript"/>
-          <w:rtl w:val="0"/>
-        </w:rPr>
-        <w:t xml:space="preserve">i</w:t>
-      </w:r>
-      <w:r>
-        <w:rPr>
-          <w:rFonts w:ascii="Times New Roman" w:cs="Times New Roman" w:eastAsia="Times New Roman" w:hAnsi="Times New Roman"/>
-          <w:b w:val="0"/>
-          <w:bCs w:val="0"/>
-          <w:i w:val="0"/>
-          <w:iCs w:val="0"/>
-          <w:sz w:val="22"/>
-          <w:szCs w:val="22"/>
-          <w:rtl w:val="0"/>
-        </w:rPr>
-        <w:t xml:space="preserve"> </w:t>
+          <w:rtl w:val="0"/>
+        </w:rPr>
+        <w:t xml:space="preserve">I</w:t>
       </w:r>
       <w:r>
         <w:rPr>
@@ -4741,9 +4687,23 @@
           <w:iCs w:val="1"/>
           <w:sz w:val="22"/>
           <w:szCs w:val="22"/>
-          <w:rtl w:val="0"/>
-        </w:rPr>
-        <w:t xml:space="preserve">I</w:t>
+          <w:vertAlign w:val="subscript"/>
+          <w:rtl w:val="0"/>
+        </w:rPr>
+        <w:t xml:space="preserve">0</w:t>
+      </w:r>
+      <w:r>
+        <w:rPr>
+          <w:rFonts w:ascii="Times New Roman" w:cs="Times New Roman" w:eastAsia="Times New Roman" w:hAnsi="Times New Roman"/>
+          <w:b w:val="0"/>
+          <w:bCs w:val="0"/>
+          <w:i w:val="0"/>
+          <w:iCs w:val="0"/>
+          <w:sz w:val="22"/>
+          <w:szCs w:val="22"/>
+          <w:rtl w:val="0"/>
+        </w:rPr>
+        <w:t xml:space="preserve"> + </w:t>
       </w:r>
       <w:r>
         <w:rPr>
@@ -4754,10 +4714,22 @@
           <w:iCs w:val="1"/>
           <w:sz w:val="22"/>
           <w:szCs w:val="22"/>
-          <w:vertAlign w:val="subscript"/>
-          <w:rtl w:val="0"/>
-        </w:rPr>
-        <w:t xml:space="preserve">i</w:t>
+          <w:rtl w:val="0"/>
+        </w:rPr>
+        <w:t xml:space="preserve">A</w:t>
+      </w:r>
+      <w:r>
+        <w:rPr>
+          <w:rFonts w:ascii="Times New Roman" w:cs="Times New Roman" w:eastAsia="Times New Roman" w:hAnsi="Times New Roman"/>
+          <w:b w:val="0"/>
+          <w:bCs w:val="0"/>
+          <w:i w:val="0"/>
+          <w:iCs w:val="0"/>
+          <w:sz w:val="22"/>
+          <w:szCs w:val="22"/>
+          <w:rtl w:val="0"/>
+        </w:rPr>
+        <w:t xml:space="preserve"> Σ</w:t>
       </w:r>
       <w:r>
         <w:rPr>
@@ -4768,9 +4740,23 @@
           <w:iCs w:val="1"/>
           <w:sz w:val="22"/>
           <w:szCs w:val="22"/>
-          <w:rtl w:val="0"/>
-        </w:rPr>
-        <w:t xml:space="preserve">t</w:t>
+          <w:vertAlign w:val="subscript"/>
+          <w:rtl w:val="0"/>
+        </w:rPr>
+        <w:t xml:space="preserve">i</w:t>
+      </w:r>
+      <w:r>
+        <w:rPr>
+          <w:rFonts w:ascii="Times New Roman" w:cs="Times New Roman" w:eastAsia="Times New Roman" w:hAnsi="Times New Roman"/>
+          <w:b w:val="0"/>
+          <w:bCs w:val="0"/>
+          <w:i w:val="0"/>
+          <w:iCs w:val="0"/>
+          <w:sz w:val="22"/>
+          <w:szCs w:val="22"/>
+          <w:rtl w:val="0"/>
+        </w:rPr>
+        <w:t xml:space="preserve"> </w:t>
       </w:r>
       <w:r>
         <w:rPr>
@@ -4781,23 +4767,9 @@
           <w:iCs w:val="1"/>
           <w:sz w:val="22"/>
           <w:szCs w:val="22"/>
-          <w:vertAlign w:val="subscript"/>
-          <w:rtl w:val="0"/>
-        </w:rPr>
-        <w:t xml:space="preserve">i</w:t>
-      </w:r>
-      <w:r>
-        <w:rPr>
-          <w:rFonts w:ascii="Times New Roman" w:cs="Times New Roman" w:eastAsia="Times New Roman" w:hAnsi="Times New Roman"/>
-          <w:b w:val="0"/>
-          <w:bCs w:val="0"/>
-          <w:i w:val="0"/>
-          <w:iCs w:val="0"/>
-          <w:sz w:val="22"/>
-          <w:szCs w:val="22"/>
-          <w:rtl w:val="0"/>
-        </w:rPr>
-        <w:t xml:space="preserve"> / </w:t>
+          <w:rtl w:val="0"/>
+        </w:rPr>
+        <w:t xml:space="preserve">I</w:t>
       </w:r>
       <w:r>
         <w:rPr>
@@ -4808,9 +4780,10 @@
           <w:iCs w:val="1"/>
           <w:sz w:val="22"/>
           <w:szCs w:val="22"/>
-          <w:rtl w:val="0"/>
-        </w:rPr>
-        <w:t xml:space="preserve">T</w:t>
+          <w:vertAlign w:val="subscript"/>
+          <w:rtl w:val="0"/>
+        </w:rPr>
+        <w:t xml:space="preserve">i</w:t>
       </w:r>
       <w:r>
         <w:rPr>
@@ -4821,23 +4794,36 @@
           <w:iCs w:val="1"/>
           <w:sz w:val="22"/>
           <w:szCs w:val="22"/>
+          <w:rtl w:val="0"/>
+        </w:rPr>
+        <w:t xml:space="preserve">t</w:t>
+      </w:r>
+      <w:r>
+        <w:rPr>
+          <w:rFonts w:ascii="Times New Roman" w:cs="Times New Roman" w:eastAsia="Times New Roman" w:hAnsi="Times New Roman"/>
+          <w:b w:val="0"/>
+          <w:bCs w:val="0"/>
+          <w:i w:val="1"/>
+          <w:iCs w:val="1"/>
+          <w:sz w:val="22"/>
+          <w:szCs w:val="22"/>
           <w:vertAlign w:val="subscript"/>
           <w:rtl w:val="0"/>
         </w:rPr>
-        <w:t xml:space="preserve">c</w:t>
-      </w:r>
-      <w:r>
-        <w:rPr>
-          <w:rFonts w:ascii="Times New Roman" w:cs="Times New Roman" w:eastAsia="Times New Roman" w:hAnsi="Times New Roman"/>
-          <w:b w:val="0"/>
-          <w:bCs w:val="0"/>
-          <w:i w:val="0"/>
-          <w:iCs w:val="0"/>
-          <w:sz w:val="22"/>
-          <w:szCs w:val="22"/>
-          <w:rtl w:val="0"/>
-        </w:rPr>
-        <w:t xml:space="preserve">,     </w:t>
+        <w:t xml:space="preserve">i</w:t>
+      </w:r>
+      <w:r>
+        <w:rPr>
+          <w:rFonts w:ascii="Times New Roman" w:cs="Times New Roman" w:eastAsia="Times New Roman" w:hAnsi="Times New Roman"/>
+          <w:b w:val="0"/>
+          <w:bCs w:val="0"/>
+          <w:i w:val="0"/>
+          <w:iCs w:val="0"/>
+          <w:sz w:val="22"/>
+          <w:szCs w:val="22"/>
+          <w:rtl w:val="0"/>
+        </w:rPr>
+        <w:t xml:space="preserve"> / 86 400 s,     </w:t>
       </w:r>
       <w:r>
         <w:rPr>
@@ -4965,7 +4951,7 @@
           <w:szCs w:val="22"/>
           <w:rtl w:val="0"/>
         </w:rPr>
-        <w:t xml:space="preserve">With 22 mA for the CPU at 80 MHz during the 10 s recording and 28 mA at 160 MHz for ≈1 s of FFT (datasheet values [10]; FFT time to be measured), 0.15 s of radio at ≈120 mA average (335 mA TX peak [10]), 1.5 mA (HX711), 0.1 mA (preamplifier) and 20 µA in deep sleep (5 µA chip [10] plus LDO and leakage), </w:t>
+        <w:t xml:space="preserve">One acquisition costs ≈0.30 A·s: 22 mA at 80 MHz for the 10 s recording and 28 mA at 160 MHz for ≈1.5 s of FFTs [12], 0.15 s of radio at ≈120 mA average (335 mA TX peak [12]), and the microphone (≈1.4 mA), preamplifier and HX711. With </w:t>
       </w:r>
       <w:r>
         <w:rPr>
@@ -4978,20 +4964,7 @@
           <w:szCs w:val="22"/>
           <w:rtl w:val="0"/>
         </w:rPr>
-        <w:t xml:space="preserve">Ī</w:t>
-      </w:r>
-      <w:r>
-        <w:rPr>
-          <w:rFonts w:ascii="Times New Roman" w:cs="Times New Roman" w:eastAsia="Times New Roman" w:hAnsi="Times New Roman"/>
-          <w:b w:val="0"/>
-          <w:bCs w:val="0"/>
-          <w:i w:val="0"/>
-          <w:iCs w:val="0"/>
-          <w:sz w:val="22"/>
-          <w:szCs w:val="22"/>
-          <w:rtl w:val="0"/>
-        </w:rPr>
-        <w:t xml:space="preserve"> ≈ 0.47 mA at </w:t>
+        <w:t xml:space="preserve">I</w:t>
       </w:r>
       <w:r>
         <w:rPr>
@@ -5002,9 +4975,23 @@
           <w:iCs w:val="1"/>
           <w:sz w:val="22"/>
           <w:szCs w:val="22"/>
-          <w:rtl w:val="0"/>
-        </w:rPr>
-        <w:t xml:space="preserve">T</w:t>
+          <w:vertAlign w:val="subscript"/>
+          <w:rtl w:val="0"/>
+        </w:rPr>
+        <w:t xml:space="preserve">0</w:t>
+      </w:r>
+      <w:r>
+        <w:rPr>
+          <w:rFonts w:ascii="Times New Roman" w:cs="Times New Roman" w:eastAsia="Times New Roman" w:hAnsi="Times New Roman"/>
+          <w:b w:val="0"/>
+          <w:bCs w:val="0"/>
+          <w:i w:val="0"/>
+          <w:iCs w:val="0"/>
+          <w:sz w:val="22"/>
+          <w:szCs w:val="22"/>
+          <w:rtl w:val="0"/>
+        </w:rPr>
+        <w:t xml:space="preserve"> = 22 µA (2 µA wake circuit, 5 µA chip [12], LDO and leakage) and 96 periodic acquisitions per day, </w:t>
       </w:r>
       <w:r>
         <w:rPr>
@@ -5015,23 +5002,22 @@
           <w:iCs w:val="1"/>
           <w:sz w:val="22"/>
           <w:szCs w:val="22"/>
-          <w:vertAlign w:val="subscript"/>
-          <w:rtl w:val="0"/>
-        </w:rPr>
-        <w:t xml:space="preserve">c</w:t>
-      </w:r>
-      <w:r>
-        <w:rPr>
-          <w:rFonts w:ascii="Times New Roman" w:cs="Times New Roman" w:eastAsia="Times New Roman" w:hAnsi="Times New Roman"/>
-          <w:b w:val="0"/>
-          <w:bCs w:val="0"/>
-          <w:i w:val="0"/>
-          <w:iCs w:val="0"/>
-          <w:sz w:val="22"/>
-          <w:szCs w:val="22"/>
-          <w:rtl w:val="0"/>
-        </w:rPr>
-        <w:t xml:space="preserve"> = 10 min; one 3000 mAh cell with usable fraction </w:t>
+          <w:rtl w:val="0"/>
+        </w:rPr>
+        <w:t xml:space="preserve">Ī</w:t>
+      </w:r>
+      <w:r>
+        <w:rPr>
+          <w:rFonts w:ascii="Times New Roman" w:cs="Times New Roman" w:eastAsia="Times New Roman" w:hAnsi="Times New Roman"/>
+          <w:b w:val="0"/>
+          <w:bCs w:val="0"/>
+          <w:i w:val="0"/>
+          <w:iCs w:val="0"/>
+          <w:sz w:val="22"/>
+          <w:szCs w:val="22"/>
+          <w:rtl w:val="0"/>
+        </w:rPr>
+        <w:t xml:space="preserve"> ≈ 0.35 mA, and one 3000 mAh cell with </w:t>
       </w:r>
       <w:r>
         <w:rPr>
@@ -5057,7 +5043,7 @@
           <w:szCs w:val="22"/>
           <w:rtl w:val="0"/>
         </w:rPr>
-        <w:t xml:space="preserve"> = 0.8 gives </w:t>
+        <w:t xml:space="preserve"> = 0.8 lasts ≈285 days; each extra event wake costs ≈3.4 µA, so the six-month target holds up to ≈60 event wakes per day (Fig. 2), which the adaptive threshold and 20-min hold-off keep well below. </w:t>
       </w:r>
       <w:r>
         <w:rPr>
@@ -5070,86 +5056,6 @@
           <w:szCs w:val="22"/>
           <w:rtl w:val="0"/>
         </w:rPr>
-        <w:t xml:space="preserve">T</w:t>
-      </w:r>
-      <w:r>
-        <w:rPr>
-          <w:rFonts w:ascii="Times New Roman" w:cs="Times New Roman" w:eastAsia="Times New Roman" w:hAnsi="Times New Roman"/>
-          <w:b w:val="0"/>
-          <w:bCs w:val="0"/>
-          <w:i w:val="0"/>
-          <w:iCs w:val="0"/>
-          <w:sz w:val="22"/>
-          <w:szCs w:val="22"/>
-          <w:vertAlign w:val="subscript"/>
-          <w:rtl w:val="0"/>
-        </w:rPr>
-        <w:t xml:space="preserve">life</w:t>
-      </w:r>
-      <w:r>
-        <w:rPr>
-          <w:rFonts w:ascii="Times New Roman" w:cs="Times New Roman" w:eastAsia="Times New Roman" w:hAnsi="Times New Roman"/>
-          <w:b w:val="0"/>
-          <w:bCs w:val="0"/>
-          <w:i w:val="0"/>
-          <w:iCs w:val="0"/>
-          <w:sz w:val="22"/>
-          <w:szCs w:val="22"/>
-          <w:rtl w:val="0"/>
-        </w:rPr>
-        <w:t xml:space="preserve"> ≈ 210 days (Fig. 2). The CPU is ≈88% of the charge, so the record length </w:t>
-      </w:r>
-      <w:r>
-        <w:rPr>
-          <w:rFonts w:ascii="Times New Roman" w:cs="Times New Roman" w:eastAsia="Times New Roman" w:hAnsi="Times New Roman"/>
-          <w:b w:val="0"/>
-          <w:bCs w:val="0"/>
-          <w:i w:val="1"/>
-          <w:iCs w:val="1"/>
-          <w:sz w:val="22"/>
-          <w:szCs w:val="22"/>
-          <w:rtl w:val="0"/>
-        </w:rPr>
-        <w:t xml:space="preserve">T</w:t>
-      </w:r>
-      <w:r>
-        <w:rPr>
-          <w:rFonts w:ascii="Times New Roman" w:cs="Times New Roman" w:eastAsia="Times New Roman" w:hAnsi="Times New Roman"/>
-          <w:b w:val="0"/>
-          <w:bCs w:val="0"/>
-          <w:i w:val="1"/>
-          <w:iCs w:val="1"/>
-          <w:sz w:val="22"/>
-          <w:szCs w:val="22"/>
-          <w:vertAlign w:val="subscript"/>
-          <w:rtl w:val="0"/>
-        </w:rPr>
-        <w:t xml:space="preserve">a</w:t>
-      </w:r>
-      <w:r>
-        <w:rPr>
-          <w:rFonts w:ascii="Times New Roman" w:cs="Times New Roman" w:eastAsia="Times New Roman" w:hAnsi="Times New Roman"/>
-          <w:b w:val="0"/>
-          <w:bCs w:val="0"/>
-          <w:i w:val="0"/>
-          <w:iCs w:val="0"/>
-          <w:sz w:val="22"/>
-          <w:szCs w:val="22"/>
-          <w:rtl w:val="0"/>
-        </w:rPr>
-        <w:t xml:space="preserve"> and the FFT speed are the main design levers. </w:t>
-      </w:r>
-      <w:r>
-        <w:rPr>
-          <w:rFonts w:ascii="Times New Roman" w:cs="Times New Roman" w:eastAsia="Times New Roman" w:hAnsi="Times New Roman"/>
-          <w:b w:val="0"/>
-          <w:bCs w:val="0"/>
-          <w:i w:val="1"/>
-          <w:iCs w:val="1"/>
-          <w:sz w:val="22"/>
-          <w:szCs w:val="22"/>
-          <w:rtl w:val="0"/>
-        </w:rPr>
         <w:t xml:space="preserve">Hub power:</w:t>
       </w:r>
       <w:r>
@@ -5163,7 +5069,7 @@
           <w:szCs w:val="22"/>
           <w:rtl w:val="0"/>
         </w:rPr>
-        <w:t xml:space="preserve"> listening continuously (≈100 mA receive) plus the modem, the hub draws ≈0.5 W (≈12 Wh/day), against ≈45 Wh/day from the panel (5 full-sun hours, 60% conversion); three 18650 cells cover two days without sun. Enclosures are shaded and charging is cut off by temperature in summer heat.</w:t>
+        <w:t xml:space="preserve"> listening continuously (≈100 mA) plus the modem, the hub draws ≈0.5 W (≈12 Wh/day) against ≈45 Wh/day from the panel (5 full-sun hours, 60% conversion); three 18650 cells cover two days without sun.</w:t>
       </w:r>
     </w:p>
     <w:p>
@@ -5240,7 +5146,7 @@
           <w:szCs w:val="18"/>
           <w:rtl w:val="0"/>
         </w:rPr>
-        <w:t xml:space="preserve">Fig. 2.  Estimated node battery life (one 18650 cell) vs. reporting interval by (3), for three record lengths (datasheet-level estimates, to be measured).</w:t>
+        <w:t xml:space="preserve">Fig. 2.  Estimated node battery life (one 18650 cell) vs. event wake-ups per day by (3) (datasheet-level estimates, to be measured).</w:t>
       </w:r>
     </w:p>
     <w:p>
@@ -5300,7 +5206,7 @@
           <w:szCs w:val="22"/>
           <w:rtl w:val="0"/>
         </w:rPr>
-        <w:t xml:space="preserve"> weighing linearity and repeatability with reference masses from 0 to 100 kg and a temperature sweep; the vibration chain is checked with known tones (100–800 Hz) from a speaker or shaker coupled to a frame; average current is measured with a power analyser over full cycles. </w:t>
+        <w:t xml:space="preserve"> weighing linearity with reference masses (0–100 kg) and a temperature sweep; piezo and wake chains checked with known tones (100–800 Hz) and bursts from a shaker coupled to a frame; average current measured with a power analyser over full cycles. </w:t>
       </w:r>
       <w:r>
         <w:rPr>
@@ -5353,7 +5259,7 @@
           <w:szCs w:val="22"/>
           <w:rtl w:val="0"/>
         </w:rPr>
-        <w:t xml:space="preserve"> instrumented hives and one empty control platform at a cooperating apiary </w:t>
+        <w:t xml:space="preserve"> instrumented hives and one empty control platform at the cooperating apiary </w:t>
       </w:r>
       <w:r>
         <w:rPr>
@@ -5380,7 +5286,7 @@
           <w:szCs w:val="22"/>
           <w:rtl w:val="0"/>
         </w:rPr>
-        <w:t xml:space="preserve">, from installation through the spring swarming season. Ground truth: weekly inspection records (queen cells, brood, queen presence), beekeeper reports and, where possible, an entrance camera to time swarm departures. Natural swarms are rare, so detection is also tested with controlled events: removal of known masses (0.5–2 kg) and short disturbances. Each alert matches at most one labelled event within ±30 min, giving precision </w:t>
+        <w:t xml:space="preserve">, from installation through the spring swarming season, including a first night-time recording that compares hive signal with the circuit noise floor. Ground truth: weekly inspection records (queen cells, brood, queen presence), beekeeper reports and, where possible, an entrance camera. Natural swarms are rare, so detection is also tested with controlled events: removal of known masses (0.5–2 kg) and short disturbances. Each alert matches at most one labelled event within ±30 min, giving precision </w:t>
       </w:r>
       <w:r>
         <w:rPr>
@@ -5432,7 +5338,7 @@
           <w:szCs w:val="22"/>
           <w:rtl w:val="0"/>
         </w:rPr>
-        <w:t xml:space="preserve"> = TP/(TP+FN); false alarms are reported per hive-week. Thresholds are tuned on the first weeks and frozen before the evaluation period. The packet delivery ratio (PDR) is computed from sequence numbers for every hive, and the hub logs its battery voltage to check the solar energy balance.</w:t>
+        <w:t xml:space="preserve"> = TP/(TP+FN); event wakes and false alarms are counted per hive-day. Thresholds are tuned on the first weeks and frozen before the evaluation period. The packet delivery ratio (PDR) is computed from sequence numbers, and the hub logs its battery voltage to check the solar energy balance.</w:t>
       </w:r>
     </w:p>
     <w:p>
@@ -5695,7 +5601,7 @@
                 <w:szCs w:val="20"/>
                 <w:rtl w:val="0"/>
               </w:rPr>
-              <w:t xml:space="preserve">Vibration chain</w:t>
+              <w:t xml:space="preserve">Wake-up</w:t>
             </w:r>
           </w:p>
         </w:tc>
@@ -5722,7 +5628,7 @@
                 <w:szCs w:val="20"/>
                 <w:rtl w:val="0"/>
               </w:rPr>
-              <w:t xml:space="preserve">Tone frequency error, 100–800 Hz</w:t>
+              <w:t xml:space="preserve">Departures and bursts missed; false wakes</w:t>
             </w:r>
           </w:p>
         </w:tc>
@@ -5744,7 +5650,7 @@
                 <w:iCs w:val="0"/>
                 <w:rtl w:val="0"/>
               </w:rPr>
-              <w:t xml:space="preserve">≤ 2 Hz</w:t>
+              <w:t xml:space="preserve">None; ≤ 20 per hive-day</w:t>
             </w:r>
           </w:p>
         </w:tc>
@@ -6053,7 +5959,7 @@
                 <w:szCs w:val="20"/>
                 <w:rtl w:val="0"/>
               </w:rPr>
-              <w:t xml:space="preserve">Node average current; unattended run on solar hub</w:t>
+              <w:t xml:space="preserve">Projected node battery life; unattended run</w:t>
             </w:r>
           </w:p>
         </w:tc>
@@ -6079,7 +5985,7 @@
                 <w:szCs w:val="20"/>
                 <w:rtl w:val="0"/>
               </w:rPr>
-              <w:t xml:space="preserve">≤ 1 mA; ≥ 30 days</w:t>
+              <w:t xml:space="preserve">≥ 6 months; ≥ 30 days</w:t>
             </w:r>
           </w:p>
         </w:tc>
@@ -6481,7 +6387,7 @@
           <w:szCs w:val="20"/>
           <w:rtl w:val="0"/>
         </w:rPr>
-        <w:t xml:space="preserve">S. Cecchi, S. Spinsante, A. Terenzi, and S. Orcioni, "A smart sensor-based measurement system for advanced bee hive monitoring," </w:t>
+        <w:t xml:space="preserve">M. Bencsik, J. Bencsik, M. Baxter, A. Lucian, J. Romieu, and M. Millet, "Identification of the honey bee swarming process by analysing the time course of hive vibrations," </w:t>
       </w:r>
       <w:r>
         <w:rPr>
@@ -6494,7 +6400,7 @@
           <w:szCs w:val="20"/>
           <w:rtl w:val="0"/>
         </w:rPr>
-        <w:t xml:space="preserve">Sensors</w:t>
+        <w:t xml:space="preserve">Comput. Electron. Agric.</w:t>
       </w:r>
       <w:r>
         <w:rPr>
@@ -6507,7 +6413,7 @@
           <w:szCs w:val="20"/>
           <w:rtl w:val="0"/>
         </w:rPr>
-        <w:t xml:space="preserve">, vol. 20, no. 9, Art. no. 2726, May 2020, doi: 10.3390/s20092726.</w:t>
+        <w:t xml:space="preserve">, vol. 76, no. 1, pp. 44–50, 2011, doi: 10.1016/j.compag.2011.01.004.</w:t>
       </w:r>
     </w:p>
     <w:p>
@@ -6560,7 +6466,33 @@
           <w:szCs w:val="20"/>
           <w:rtl w:val="0"/>
         </w:rPr>
-        <w:t xml:space="preserve">BroodMinder, "BroodMinder-W3 four point weight scale kit." [Online]. Available: https://workerandhive.com/products/broodminder-w3-four-point-weight-scale-kit</w:t>
+        <w:t xml:space="preserve">S. Cecchi, S. Spinsante, A. Terenzi, and S. Orcioni, "A smart sensor-based measurement system for advanced bee hive monitoring," </w:t>
+      </w:r>
+      <w:r>
+        <w:rPr>
+          <w:rFonts w:ascii="Times New Roman" w:cs="Times New Roman" w:eastAsia="Times New Roman" w:hAnsi="Times New Roman"/>
+          <w:b w:val="0"/>
+          <w:bCs w:val="0"/>
+          <w:i w:val="1"/>
+          <w:iCs w:val="1"/>
+          <w:sz w:val="20"/>
+          <w:szCs w:val="20"/>
+          <w:rtl w:val="0"/>
+        </w:rPr>
+        <w:t xml:space="preserve">Sensors</w:t>
+      </w:r>
+      <w:r>
+        <w:rPr>
+          <w:rFonts w:ascii="Times New Roman" w:cs="Times New Roman" w:eastAsia="Times New Roman" w:hAnsi="Times New Roman"/>
+          <w:b w:val="0"/>
+          <w:bCs w:val="0"/>
+          <w:i w:val="0"/>
+          <w:iCs w:val="0"/>
+          <w:sz w:val="20"/>
+          <w:szCs w:val="20"/>
+          <w:rtl w:val="0"/>
+        </w:rPr>
+        <w:t xml:space="preserve">, vol. 20, no. 9, Art. no. 2726, May 2020, doi: 10.3390/s20092726.</w:t>
       </w:r>
     </w:p>
     <w:p>
@@ -6613,7 +6545,7 @@
           <w:szCs w:val="20"/>
           <w:rtl w:val="0"/>
         </w:rPr>
-        <w:t xml:space="preserve">BeeHero, "Technology." [Online]. Available: https://www.beehero.io/technology</w:t>
+        <w:t xml:space="preserve">BroodMinder, "BroodMinder-W3 four point weight scale kit." [Online]. Available: https://workerandhive.com/products/broodminder-w3-four-point-weight-scale-kit</w:t>
       </w:r>
     </w:p>
     <w:p>
@@ -6666,33 +6598,7 @@
           <w:szCs w:val="20"/>
           <w:rtl w:val="0"/>
         </w:rPr>
-        <w:t xml:space="preserve">Espressif Systems, "ESP-NOW," in </w:t>
-      </w:r>
-      <w:r>
-        <w:rPr>
-          <w:rFonts w:ascii="Times New Roman" w:cs="Times New Roman" w:eastAsia="Times New Roman" w:hAnsi="Times New Roman"/>
-          <w:b w:val="0"/>
-          <w:bCs w:val="0"/>
-          <w:i w:val="1"/>
-          <w:iCs w:val="1"/>
-          <w:sz w:val="20"/>
-          <w:szCs w:val="20"/>
-          <w:rtl w:val="0"/>
-        </w:rPr>
-        <w:t xml:space="preserve">ESP-IDF Programming Guide (ESP32-C3), v5.3.2</w:t>
-      </w:r>
-      <w:r>
-        <w:rPr>
-          <w:rFonts w:ascii="Times New Roman" w:cs="Times New Roman" w:eastAsia="Times New Roman" w:hAnsi="Times New Roman"/>
-          <w:b w:val="0"/>
-          <w:bCs w:val="0"/>
-          <w:i w:val="0"/>
-          <w:iCs w:val="0"/>
-          <w:sz w:val="20"/>
-          <w:szCs w:val="20"/>
-          <w:rtl w:val="0"/>
-        </w:rPr>
-        <w:t xml:space="preserve">. [Online]. Available: https://docs.espressif.com/projects/esp-idf/en/v5.3.2/esp32c3/api-reference/network/esp_now.html</w:t>
+        <w:t xml:space="preserve">BeeHero, "Technology." [Online]. Available: https://www.beehero.io/technology</w:t>
       </w:r>
     </w:p>
     <w:p>
@@ -6745,7 +6651,33 @@
           <w:szCs w:val="20"/>
           <w:rtl w:val="0"/>
         </w:rPr>
-        <w:t xml:space="preserve">Avia Semiconductor, "HX711: 24-bit analog-to-digital converter (ADC) for weigh scales," datasheet.</w:t>
+        <w:t xml:space="preserve">M. Bencsik, Y. Le Conte, M. Reyes, M. Pioz, D. Whittaker, D. Crauser, N. Simon Delso, and M. I. Newton, "Honeybee colony vibrational measurements to highlight the brood cycle," </w:t>
+      </w:r>
+      <w:r>
+        <w:rPr>
+          <w:rFonts w:ascii="Times New Roman" w:cs="Times New Roman" w:eastAsia="Times New Roman" w:hAnsi="Times New Roman"/>
+          <w:b w:val="0"/>
+          <w:bCs w:val="0"/>
+          <w:i w:val="1"/>
+          <w:iCs w:val="1"/>
+          <w:sz w:val="20"/>
+          <w:szCs w:val="20"/>
+          <w:rtl w:val="0"/>
+        </w:rPr>
+        <w:t xml:space="preserve">PLoS ONE</w:t>
+      </w:r>
+      <w:r>
+        <w:rPr>
+          <w:rFonts w:ascii="Times New Roman" w:cs="Times New Roman" w:eastAsia="Times New Roman" w:hAnsi="Times New Roman"/>
+          <w:b w:val="0"/>
+          <w:bCs w:val="0"/>
+          <w:i w:val="0"/>
+          <w:iCs w:val="0"/>
+          <w:sz w:val="20"/>
+          <w:szCs w:val="20"/>
+          <w:rtl w:val="0"/>
+        </w:rPr>
+        <w:t xml:space="preserve">, vol. 10, no. 11, Art. no. e0141926, Nov. 2015, doi: 10.1371/journal.pone.0141926.</w:t>
       </w:r>
     </w:p>
     <w:p>
@@ -6798,7 +6730,139 @@
           <w:szCs w:val="20"/>
           <w:rtl w:val="0"/>
         </w:rPr>
-        <w:t xml:space="preserve">Espressif Systems, "ESP32-C3 series datasheet," [Online]. Available: https://www.espressif.com/en/support/documents/technical-documents</w:t>
+        <w:t xml:space="preserve">Espressif Systems, "ESP-NOW," in </w:t>
+      </w:r>
+      <w:r>
+        <w:rPr>
+          <w:rFonts w:ascii="Times New Roman" w:cs="Times New Roman" w:eastAsia="Times New Roman" w:hAnsi="Times New Roman"/>
+          <w:b w:val="0"/>
+          <w:bCs w:val="0"/>
+          <w:i w:val="1"/>
+          <w:iCs w:val="1"/>
+          <w:sz w:val="20"/>
+          <w:szCs w:val="20"/>
+          <w:rtl w:val="0"/>
+        </w:rPr>
+        <w:t xml:space="preserve">ESP-IDF Programming Guide (ESP32-C3), v5.3.2</w:t>
+      </w:r>
+      <w:r>
+        <w:rPr>
+          <w:rFonts w:ascii="Times New Roman" w:cs="Times New Roman" w:eastAsia="Times New Roman" w:hAnsi="Times New Roman"/>
+          <w:b w:val="0"/>
+          <w:bCs w:val="0"/>
+          <w:i w:val="0"/>
+          <w:iCs w:val="0"/>
+          <w:sz w:val="20"/>
+          <w:szCs w:val="20"/>
+          <w:rtl w:val="0"/>
+        </w:rPr>
+        <w:t xml:space="preserve">. [Online]. Available: https://docs.espressif.com/projects/esp-idf/en/v5.3.2/esp32c3/api-reference/network/esp_now.html</w:t>
+      </w:r>
+    </w:p>
+    <w:p>
+      <w:pPr>
+        <w:tabs>
+          <w:tab w:val="left" w:leader="none" w:pos="510"/>
+        </w:tabs>
+        <w:spacing w:after="80" w:before="0" w:line="240" w:lineRule="auto"/>
+        <w:ind w:left="510" w:hanging="510"/>
+        <w:jc w:val="left"/>
+        <w:rPr>
+          <w:sz w:val="22"/>
+          <w:szCs w:val="22"/>
+        </w:rPr>
+      </w:pPr>
+      <w:r>
+        <w:rPr>
+          <w:rFonts w:ascii="Times New Roman" w:cs="Times New Roman" w:eastAsia="Times New Roman" w:hAnsi="Times New Roman"/>
+          <w:b w:val="0"/>
+          <w:bCs w:val="0"/>
+          <w:i w:val="0"/>
+          <w:iCs w:val="0"/>
+          <w:sz w:val="20"/>
+          <w:szCs w:val="20"/>
+          <w:rtl w:val="0"/>
+        </w:rPr>
+        <w:t xml:space="preserve">[11]</w:t>
+      </w:r>
+      <w:r>
+        <w:rPr>
+          <w:rFonts w:ascii="Times New Roman" w:cs="Times New Roman" w:eastAsia="Times New Roman" w:hAnsi="Times New Roman"/>
+          <w:b w:val="0"/>
+          <w:bCs w:val="0"/>
+          <w:i w:val="0"/>
+          <w:iCs w:val="0"/>
+          <w:sz w:val="20"/>
+          <w:szCs w:val="20"/>
+          <w:rtl w:val="0"/>
+        </w:rPr>
+        <w:tab/>
+      </w:r>
+      <w:r>
+        <w:rPr>
+          <w:rFonts w:ascii="Times New Roman" w:cs="Times New Roman" w:eastAsia="Times New Roman" w:hAnsi="Times New Roman"/>
+          <w:b w:val="0"/>
+          <w:bCs w:val="0"/>
+          <w:i w:val="0"/>
+          <w:iCs w:val="0"/>
+          <w:sz w:val="20"/>
+          <w:szCs w:val="20"/>
+          <w:rtl w:val="0"/>
+        </w:rPr>
+        <w:t xml:space="preserve">Avia Semiconductor, "HX711: 24-bit analog-to-digital converter (ADC) for weigh scales," datasheet.</w:t>
+      </w:r>
+    </w:p>
+    <w:p>
+      <w:pPr>
+        <w:tabs>
+          <w:tab w:val="left" w:leader="none" w:pos="510"/>
+        </w:tabs>
+        <w:spacing w:after="80" w:before="0" w:line="240" w:lineRule="auto"/>
+        <w:ind w:left="510" w:hanging="510"/>
+        <w:jc w:val="left"/>
+        <w:rPr>
+          <w:sz w:val="22"/>
+          <w:szCs w:val="22"/>
+        </w:rPr>
+      </w:pPr>
+      <w:r>
+        <w:rPr>
+          <w:rFonts w:ascii="Times New Roman" w:cs="Times New Roman" w:eastAsia="Times New Roman" w:hAnsi="Times New Roman"/>
+          <w:b w:val="0"/>
+          <w:bCs w:val="0"/>
+          <w:i w:val="0"/>
+          <w:iCs w:val="0"/>
+          <w:sz w:val="20"/>
+          <w:szCs w:val="20"/>
+          <w:rtl w:val="0"/>
+        </w:rPr>
+        <w:t xml:space="preserve">[12]</w:t>
+      </w:r>
+      <w:r>
+        <w:rPr>
+          <w:rFonts w:ascii="Times New Roman" w:cs="Times New Roman" w:eastAsia="Times New Roman" w:hAnsi="Times New Roman"/>
+          <w:b w:val="0"/>
+          <w:bCs w:val="0"/>
+          <w:i w:val="0"/>
+          <w:iCs w:val="0"/>
+          <w:sz w:val="20"/>
+          <w:szCs w:val="20"/>
+          <w:rtl w:val="0"/>
+        </w:rPr>
+        <w:tab/>
+      </w:r>
+      <w:r>
+        <w:rPr>
+          <w:rFonts w:ascii="Times New Roman" w:cs="Times New Roman" w:eastAsia="Times New Roman" w:hAnsi="Times New Roman"/>
+          <w:b w:val="0"/>
+          <w:bCs w:val="0"/>
+          <w:i w:val="0"/>
+          <w:iCs w:val="0"/>
+          <w:sz w:val="20"/>
+          <w:szCs w:val="20"/>
+          <w:rtl w:val="0"/>
+        </w:rPr>
+        <w:t xml:space="preserve">Espressif Systems, "ESP32-C3 series datasheet." [Online]. Available: https://www.espressif.com/en/support/documents/technical-documents</w:t>
       </w:r>
     </w:p>
     <w:p>

</xml_diff>